<commit_message>
docs: update PC6M-10 software design document
</commit_message>
<xml_diff>
--- a/docs/project/PC6M10_软件设计及开发文档_V1.1.docx
+++ b/docs/project/PC6M10_软件设计及开发文档_V1.1.docx
@@ -352,13 +352,22 @@
           <w:szCs w:val="22"/>
           <w:lang w:val="en-US" w:eastAsia="en-US" w:bidi="ar-SA"/>
         </w:rPr>
-        <w:id w:val="147473152"/>
+        <w:id w:val="147471584"/>
         <w15:color w:val="DBDBDB"/>
         <w:docPartObj>
           <w:docPartGallery w:val="Table of Contents"/>
           <w:docPartUnique/>
         </w:docPartObj>
       </w:sdtPr>
+      <w:sdtEndPr>
+        <w:rPr>
+          <w:rFonts w:ascii="宋体" w:hAnsi="宋体" w:eastAsia="宋体" w:cstheme="minorBidi"/>
+          <w:color w:val="111827"/>
+          <w:sz w:val="24"/>
+          <w:szCs w:val="22"/>
+          <w:lang w:val="en-US" w:eastAsia="en-US" w:bidi="ar-SA"/>
+        </w:rPr>
+      </w:sdtEndPr>
       <w:sdtContent>
         <w:p>
           <w:pPr>
@@ -394,7 +403,7 @@
             <w:fldChar w:fldCharType="begin"/>
           </w:r>
           <w:r>
-            <w:instrText xml:space="preserve"> HYPERLINK \l _Toc7190 </w:instrText>
+            <w:instrText xml:space="preserve"> HYPERLINK \l _Toc15916 </w:instrText>
           </w:r>
           <w:r>
             <w:fldChar w:fldCharType="separate"/>
@@ -412,7 +421,7 @@
             <w:fldChar w:fldCharType="begin"/>
           </w:r>
           <w:r>
-            <w:instrText xml:space="preserve"> PAGEREF _Toc7190 \h </w:instrText>
+            <w:instrText xml:space="preserve"> PAGEREF _Toc15916 \h </w:instrText>
           </w:r>
           <w:r>
             <w:fldChar w:fldCharType="separate"/>
@@ -438,7 +447,7 @@
             <w:fldChar w:fldCharType="begin"/>
           </w:r>
           <w:r>
-            <w:instrText xml:space="preserve"> HYPERLINK \l _Toc20298 </w:instrText>
+            <w:instrText xml:space="preserve"> HYPERLINK \l _Toc611 </w:instrText>
           </w:r>
           <w:r>
             <w:fldChar w:fldCharType="separate"/>
@@ -456,7 +465,7 @@
             <w:fldChar w:fldCharType="begin"/>
           </w:r>
           <w:r>
-            <w:instrText xml:space="preserve"> PAGEREF _Toc20298 \h </w:instrText>
+            <w:instrText xml:space="preserve"> PAGEREF _Toc611 \h </w:instrText>
           </w:r>
           <w:r>
             <w:fldChar w:fldCharType="separate"/>
@@ -482,7 +491,7 @@
             <w:fldChar w:fldCharType="begin"/>
           </w:r>
           <w:r>
-            <w:instrText xml:space="preserve"> HYPERLINK \l _Toc9497 </w:instrText>
+            <w:instrText xml:space="preserve"> HYPERLINK \l _Toc28292 </w:instrText>
           </w:r>
           <w:r>
             <w:fldChar w:fldCharType="separate"/>
@@ -500,7 +509,7 @@
             <w:fldChar w:fldCharType="begin"/>
           </w:r>
           <w:r>
-            <w:instrText xml:space="preserve"> PAGEREF _Toc9497 \h </w:instrText>
+            <w:instrText xml:space="preserve"> PAGEREF _Toc28292 \h </w:instrText>
           </w:r>
           <w:r>
             <w:fldChar w:fldCharType="separate"/>
@@ -526,7 +535,7 @@
             <w:fldChar w:fldCharType="begin"/>
           </w:r>
           <w:r>
-            <w:instrText xml:space="preserve"> HYPERLINK \l _Toc1370 </w:instrText>
+            <w:instrText xml:space="preserve"> HYPERLINK \l _Toc13440 </w:instrText>
           </w:r>
           <w:r>
             <w:fldChar w:fldCharType="separate"/>
@@ -535,7 +544,7 @@
             <w:rPr>
               <w:rFonts w:ascii="黑体" w:hAnsi="黑体" w:eastAsia="黑体" w:cs="黑体"/>
             </w:rPr>
-            <w:t>目录</w:t>
+            <w:t>1  项目背景</w:t>
           </w:r>
           <w:r>
             <w:tab/>
@@ -544,13 +553,189 @@
             <w:fldChar w:fldCharType="begin"/>
           </w:r>
           <w:r>
-            <w:instrText xml:space="preserve"> PAGEREF _Toc1370 \h </w:instrText>
+            <w:instrText xml:space="preserve"> PAGEREF _Toc13440 \h </w:instrText>
           </w:r>
           <w:r>
             <w:fldChar w:fldCharType="separate"/>
           </w:r>
           <w:r>
-            <w:t>5</w:t>
+            <w:t>6</w:t>
+          </w:r>
+          <w:r>
+            <w:fldChar w:fldCharType="end"/>
+          </w:r>
+          <w:r>
+            <w:fldChar w:fldCharType="end"/>
+          </w:r>
+        </w:p>
+        <w:p>
+          <w:pPr>
+            <w:pStyle w:val="29"/>
+            <w:tabs>
+              <w:tab w:val="right" w:leader="dot" w:pos="9360"/>
+            </w:tabs>
+          </w:pPr>
+          <w:r>
+            <w:fldChar w:fldCharType="begin"/>
+          </w:r>
+          <w:r>
+            <w:instrText xml:space="preserve"> HYPERLINK \l _Toc25949 </w:instrText>
+          </w:r>
+          <w:r>
+            <w:fldChar w:fldCharType="separate"/>
+          </w:r>
+          <w:r>
+            <w:rPr>
+              <w:rFonts w:ascii="黑体" w:hAnsi="黑体" w:eastAsia="黑体" w:cs="黑体"/>
+            </w:rPr>
+            <w:t>1.1 产品背景</w:t>
+          </w:r>
+          <w:r>
+            <w:tab/>
+          </w:r>
+          <w:r>
+            <w:fldChar w:fldCharType="begin"/>
+          </w:r>
+          <w:r>
+            <w:instrText xml:space="preserve"> PAGEREF _Toc25949 \h </w:instrText>
+          </w:r>
+          <w:r>
+            <w:fldChar w:fldCharType="separate"/>
+          </w:r>
+          <w:r>
+            <w:t>6</w:t>
+          </w:r>
+          <w:r>
+            <w:fldChar w:fldCharType="end"/>
+          </w:r>
+          <w:r>
+            <w:fldChar w:fldCharType="end"/>
+          </w:r>
+        </w:p>
+        <w:p>
+          <w:pPr>
+            <w:pStyle w:val="29"/>
+            <w:tabs>
+              <w:tab w:val="right" w:leader="dot" w:pos="9360"/>
+            </w:tabs>
+          </w:pPr>
+          <w:r>
+            <w:fldChar w:fldCharType="begin"/>
+          </w:r>
+          <w:r>
+            <w:instrText xml:space="preserve"> HYPERLINK \l _Toc9349 </w:instrText>
+          </w:r>
+          <w:r>
+            <w:fldChar w:fldCharType="separate"/>
+          </w:r>
+          <w:r>
+            <w:rPr>
+              <w:rFonts w:ascii="黑体" w:hAnsi="黑体" w:eastAsia="黑体" w:cs="黑体"/>
+            </w:rPr>
+            <w:t>1.2 建设目标</w:t>
+          </w:r>
+          <w:r>
+            <w:tab/>
+          </w:r>
+          <w:r>
+            <w:fldChar w:fldCharType="begin"/>
+          </w:r>
+          <w:r>
+            <w:instrText xml:space="preserve"> PAGEREF _Toc9349 \h </w:instrText>
+          </w:r>
+          <w:r>
+            <w:fldChar w:fldCharType="separate"/>
+          </w:r>
+          <w:r>
+            <w:t>6</w:t>
+          </w:r>
+          <w:r>
+            <w:fldChar w:fldCharType="end"/>
+          </w:r>
+          <w:r>
+            <w:fldChar w:fldCharType="end"/>
+          </w:r>
+        </w:p>
+        <w:p>
+          <w:pPr>
+            <w:pStyle w:val="29"/>
+            <w:tabs>
+              <w:tab w:val="right" w:leader="dot" w:pos="9360"/>
+            </w:tabs>
+          </w:pPr>
+          <w:r>
+            <w:fldChar w:fldCharType="begin"/>
+          </w:r>
+          <w:r>
+            <w:instrText xml:space="preserve"> HYPERLINK \l _Toc9029 </w:instrText>
+          </w:r>
+          <w:r>
+            <w:fldChar w:fldCharType="separate"/>
+          </w:r>
+          <w:r>
+            <w:rPr>
+              <w:rFonts w:ascii="黑体" w:hAnsi="黑体" w:eastAsia="黑体" w:cs="黑体"/>
+            </w:rPr>
+            <w:t>1.3 设计范围</w:t>
+          </w:r>
+          <w:r>
+            <w:tab/>
+          </w:r>
+          <w:r>
+            <w:fldChar w:fldCharType="begin"/>
+          </w:r>
+          <w:r>
+            <w:instrText xml:space="preserve"> PAGEREF _Toc9029 \h </w:instrText>
+          </w:r>
+          <w:r>
+            <w:fldChar w:fldCharType="separate"/>
+          </w:r>
+          <w:r>
+            <w:t>6</w:t>
+          </w:r>
+          <w:r>
+            <w:fldChar w:fldCharType="end"/>
+          </w:r>
+          <w:r>
+            <w:fldChar w:fldCharType="end"/>
+          </w:r>
+        </w:p>
+        <w:p>
+          <w:pPr>
+            <w:pStyle w:val="29"/>
+            <w:tabs>
+              <w:tab w:val="right" w:leader="dot" w:pos="9360"/>
+            </w:tabs>
+          </w:pPr>
+          <w:r>
+            <w:fldChar w:fldCharType="begin"/>
+          </w:r>
+          <w:r>
+            <w:instrText xml:space="preserve"> HYPERLINK \l _Toc7693 </w:instrText>
+          </w:r>
+          <w:r>
+            <w:fldChar w:fldCharType="separate"/>
+          </w:r>
+          <w:r>
+            <w:rPr>
+              <w:rFonts w:ascii="黑体" w:hAnsi="黑体" w:eastAsia="黑体" w:cs="黑体"/>
+            </w:rPr>
+            <w:t>1.4 关键质量属性</w:t>
+          </w:r>
+          <w:r>
+            <w:tab/>
+          </w:r>
+          <w:r>
+            <w:fldChar w:fldCharType="begin"/>
+          </w:r>
+          <w:r>
+            <w:instrText xml:space="preserve"> PAGEREF _Toc7693 \h </w:instrText>
+          </w:r>
+          <w:r>
+            <w:fldChar w:fldCharType="separate"/>
+          </w:r>
+          <w:r>
+            <w:t>7</w:t>
           </w:r>
           <w:r>
             <w:fldChar w:fldCharType="end"/>
@@ -570,7 +755,7 @@
             <w:fldChar w:fldCharType="begin"/>
           </w:r>
           <w:r>
-            <w:instrText xml:space="preserve"> HYPERLINK \l _Toc28604 </w:instrText>
+            <w:instrText xml:space="preserve"> HYPERLINK \l _Toc1415 </w:instrText>
           </w:r>
           <w:r>
             <w:fldChar w:fldCharType="separate"/>
@@ -579,7 +764,7 @@
             <w:rPr>
               <w:rFonts w:ascii="黑体" w:hAnsi="黑体" w:eastAsia="黑体" w:cs="黑体"/>
             </w:rPr>
-            <w:t>1  项目背景</w:t>
+            <w:t>2  系统概述</w:t>
           </w:r>
           <w:r>
             <w:tab/>
@@ -588,13 +773,13 @@
             <w:fldChar w:fldCharType="begin"/>
           </w:r>
           <w:r>
-            <w:instrText xml:space="preserve"> PAGEREF _Toc28604 \h </w:instrText>
+            <w:instrText xml:space="preserve"> PAGEREF _Toc1415 \h </w:instrText>
           </w:r>
           <w:r>
             <w:fldChar w:fldCharType="separate"/>
           </w:r>
           <w:r>
-            <w:t>6</w:t>
+            <w:t>7</w:t>
           </w:r>
           <w:r>
             <w:fldChar w:fldCharType="end"/>
@@ -614,7 +799,7 @@
             <w:fldChar w:fldCharType="begin"/>
           </w:r>
           <w:r>
-            <w:instrText xml:space="preserve"> HYPERLINK \l _Toc16022 </w:instrText>
+            <w:instrText xml:space="preserve"> HYPERLINK \l _Toc20697 </w:instrText>
           </w:r>
           <w:r>
             <w:fldChar w:fldCharType="separate"/>
@@ -623,7 +808,7 @@
             <w:rPr>
               <w:rFonts w:ascii="黑体" w:hAnsi="黑体" w:eastAsia="黑体" w:cs="黑体"/>
             </w:rPr>
-            <w:t>1.1 产品背景</w:t>
+            <w:t>2.1 硬件平台</w:t>
           </w:r>
           <w:r>
             <w:tab/>
@@ -632,13 +817,13 @@
             <w:fldChar w:fldCharType="begin"/>
           </w:r>
           <w:r>
-            <w:instrText xml:space="preserve"> PAGEREF _Toc16022 \h </w:instrText>
+            <w:instrText xml:space="preserve"> PAGEREF _Toc20697 \h </w:instrText>
           </w:r>
           <w:r>
             <w:fldChar w:fldCharType="separate"/>
           </w:r>
           <w:r>
-            <w:t>6</w:t>
+            <w:t>7</w:t>
           </w:r>
           <w:r>
             <w:fldChar w:fldCharType="end"/>
@@ -658,7 +843,7 @@
             <w:fldChar w:fldCharType="begin"/>
           </w:r>
           <w:r>
-            <w:instrText xml:space="preserve"> HYPERLINK \l _Toc22967 </w:instrText>
+            <w:instrText xml:space="preserve"> HYPERLINK \l _Toc3606 </w:instrText>
           </w:r>
           <w:r>
             <w:fldChar w:fldCharType="separate"/>
@@ -667,7 +852,7 @@
             <w:rPr>
               <w:rFonts w:ascii="黑体" w:hAnsi="黑体" w:eastAsia="黑体" w:cs="黑体"/>
             </w:rPr>
-            <w:t>1.2 建设目标</w:t>
+            <w:t>2.2 软件运行模型</w:t>
           </w:r>
           <w:r>
             <w:tab/>
@@ -676,13 +861,13 @@
             <w:fldChar w:fldCharType="begin"/>
           </w:r>
           <w:r>
-            <w:instrText xml:space="preserve"> PAGEREF _Toc22967 \h </w:instrText>
+            <w:instrText xml:space="preserve"> PAGEREF _Toc3606 \h </w:instrText>
           </w:r>
           <w:r>
             <w:fldChar w:fldCharType="separate"/>
           </w:r>
           <w:r>
-            <w:t>6</w:t>
+            <w:t>8</w:t>
           </w:r>
           <w:r>
             <w:fldChar w:fldCharType="end"/>
@@ -702,7 +887,7 @@
             <w:fldChar w:fldCharType="begin"/>
           </w:r>
           <w:r>
-            <w:instrText xml:space="preserve"> HYPERLINK \l _Toc7226 </w:instrText>
+            <w:instrText xml:space="preserve"> HYPERLINK \l _Toc19312 </w:instrText>
           </w:r>
           <w:r>
             <w:fldChar w:fldCharType="separate"/>
@@ -711,7 +896,7 @@
             <w:rPr>
               <w:rFonts w:ascii="黑体" w:hAnsi="黑体" w:eastAsia="黑体" w:cs="黑体"/>
             </w:rPr>
-            <w:t>1.3 设计范围</w:t>
+            <w:t>2.3 分层架构</w:t>
           </w:r>
           <w:r>
             <w:tab/>
@@ -720,13 +905,57 @@
             <w:fldChar w:fldCharType="begin"/>
           </w:r>
           <w:r>
-            <w:instrText xml:space="preserve"> PAGEREF _Toc7226 \h </w:instrText>
+            <w:instrText xml:space="preserve"> PAGEREF _Toc19312 \h </w:instrText>
           </w:r>
           <w:r>
             <w:fldChar w:fldCharType="separate"/>
           </w:r>
           <w:r>
-            <w:t>6</w:t>
+            <w:t>8</w:t>
+          </w:r>
+          <w:r>
+            <w:fldChar w:fldCharType="end"/>
+          </w:r>
+          <w:r>
+            <w:fldChar w:fldCharType="end"/>
+          </w:r>
+        </w:p>
+        <w:p>
+          <w:pPr>
+            <w:pStyle w:val="26"/>
+            <w:tabs>
+              <w:tab w:val="right" w:leader="dot" w:pos="9360"/>
+            </w:tabs>
+          </w:pPr>
+          <w:r>
+            <w:fldChar w:fldCharType="begin"/>
+          </w:r>
+          <w:r>
+            <w:instrText xml:space="preserve"> HYPERLINK \l _Toc31776 </w:instrText>
+          </w:r>
+          <w:r>
+            <w:fldChar w:fldCharType="separate"/>
+          </w:r>
+          <w:r>
+            <w:rPr>
+              <w:rFonts w:ascii="黑体" w:hAnsi="黑体" w:eastAsia="黑体" w:cs="黑体"/>
+            </w:rPr>
+            <w:t>3  软件总体设计</w:t>
+          </w:r>
+          <w:r>
+            <w:tab/>
+          </w:r>
+          <w:r>
+            <w:fldChar w:fldCharType="begin"/>
+          </w:r>
+          <w:r>
+            <w:instrText xml:space="preserve"> PAGEREF _Toc31776 \h </w:instrText>
+          </w:r>
+          <w:r>
+            <w:fldChar w:fldCharType="separate"/>
+          </w:r>
+          <w:r>
+            <w:t>9</w:t>
           </w:r>
           <w:r>
             <w:fldChar w:fldCharType="end"/>
@@ -746,7 +975,7 @@
             <w:fldChar w:fldCharType="begin"/>
           </w:r>
           <w:r>
-            <w:instrText xml:space="preserve"> HYPERLINK \l _Toc22573 </w:instrText>
+            <w:instrText xml:space="preserve"> HYPERLINK \l _Toc6156 </w:instrText>
           </w:r>
           <w:r>
             <w:fldChar w:fldCharType="separate"/>
@@ -755,7 +984,7 @@
             <w:rPr>
               <w:rFonts w:ascii="黑体" w:hAnsi="黑体" w:eastAsia="黑体" w:cs="黑体"/>
             </w:rPr>
-            <w:t>1.4 关键质量属性</w:t>
+            <w:t>3.1 启动流程</w:t>
           </w:r>
           <w:r>
             <w:tab/>
@@ -764,13 +993,145 @@
             <w:fldChar w:fldCharType="begin"/>
           </w:r>
           <w:r>
-            <w:instrText xml:space="preserve"> PAGEREF _Toc22573 \h </w:instrText>
+            <w:instrText xml:space="preserve"> PAGEREF _Toc6156 \h </w:instrText>
           </w:r>
           <w:r>
             <w:fldChar w:fldCharType="separate"/>
           </w:r>
           <w:r>
-            <w:t>7</w:t>
+            <w:t>9</w:t>
+          </w:r>
+          <w:r>
+            <w:fldChar w:fldCharType="end"/>
+          </w:r>
+          <w:r>
+            <w:fldChar w:fldCharType="end"/>
+          </w:r>
+        </w:p>
+        <w:p>
+          <w:pPr>
+            <w:pStyle w:val="29"/>
+            <w:tabs>
+              <w:tab w:val="right" w:leader="dot" w:pos="9360"/>
+            </w:tabs>
+          </w:pPr>
+          <w:r>
+            <w:fldChar w:fldCharType="begin"/>
+          </w:r>
+          <w:r>
+            <w:instrText xml:space="preserve"> HYPERLINK \l _Toc16838 </w:instrText>
+          </w:r>
+          <w:r>
+            <w:fldChar w:fldCharType="separate"/>
+          </w:r>
+          <w:r>
+            <w:rPr>
+              <w:rFonts w:ascii="黑体" w:hAnsi="黑体" w:eastAsia="黑体" w:cs="黑体"/>
+            </w:rPr>
+            <w:t>3.2 内存布局</w:t>
+          </w:r>
+          <w:r>
+            <w:tab/>
+          </w:r>
+          <w:r>
+            <w:fldChar w:fldCharType="begin"/>
+          </w:r>
+          <w:r>
+            <w:instrText xml:space="preserve"> PAGEREF _Toc16838 \h </w:instrText>
+          </w:r>
+          <w:r>
+            <w:fldChar w:fldCharType="separate"/>
+          </w:r>
+          <w:r>
+            <w:t>9</w:t>
+          </w:r>
+          <w:r>
+            <w:fldChar w:fldCharType="end"/>
+          </w:r>
+          <w:r>
+            <w:fldChar w:fldCharType="end"/>
+          </w:r>
+        </w:p>
+        <w:p>
+          <w:pPr>
+            <w:pStyle w:val="29"/>
+            <w:tabs>
+              <w:tab w:val="right" w:leader="dot" w:pos="9360"/>
+            </w:tabs>
+          </w:pPr>
+          <w:r>
+            <w:fldChar w:fldCharType="begin"/>
+          </w:r>
+          <w:r>
+            <w:instrText xml:space="preserve"> HYPERLINK \l _Toc30155 </w:instrText>
+          </w:r>
+          <w:r>
+            <w:fldChar w:fldCharType="separate"/>
+          </w:r>
+          <w:r>
+            <w:rPr>
+              <w:rFonts w:ascii="黑体" w:hAnsi="黑体" w:eastAsia="黑体" w:cs="黑体"/>
+            </w:rPr>
+            <w:t>3.3 中断体系</w:t>
+          </w:r>
+          <w:r>
+            <w:tab/>
+          </w:r>
+          <w:r>
+            <w:fldChar w:fldCharType="begin"/>
+          </w:r>
+          <w:r>
+            <w:instrText xml:space="preserve"> PAGEREF _Toc30155 \h </w:instrText>
+          </w:r>
+          <w:r>
+            <w:fldChar w:fldCharType="separate"/>
+          </w:r>
+          <w:r>
+            <w:t>10</w:t>
+          </w:r>
+          <w:r>
+            <w:fldChar w:fldCharType="end"/>
+          </w:r>
+          <w:r>
+            <w:fldChar w:fldCharType="end"/>
+          </w:r>
+        </w:p>
+        <w:p>
+          <w:pPr>
+            <w:pStyle w:val="29"/>
+            <w:tabs>
+              <w:tab w:val="right" w:leader="dot" w:pos="9360"/>
+            </w:tabs>
+          </w:pPr>
+          <w:r>
+            <w:fldChar w:fldCharType="begin"/>
+          </w:r>
+          <w:r>
+            <w:instrText xml:space="preserve"> HYPERLINK \l _Toc2320 </w:instrText>
+          </w:r>
+          <w:r>
+            <w:fldChar w:fldCharType="separate"/>
+          </w:r>
+          <w:r>
+            <w:rPr>
+              <w:rFonts w:ascii="黑体" w:hAnsi="黑体" w:eastAsia="黑体" w:cs="黑体"/>
+            </w:rPr>
+            <w:t>3.4 安全状态</w:t>
+          </w:r>
+          <w:r>
+            <w:tab/>
+          </w:r>
+          <w:r>
+            <w:fldChar w:fldCharType="begin"/>
+          </w:r>
+          <w:r>
+            <w:instrText xml:space="preserve"> PAGEREF _Toc2320 \h </w:instrText>
+          </w:r>
+          <w:r>
+            <w:fldChar w:fldCharType="separate"/>
+          </w:r>
+          <w:r>
+            <w:t>10</w:t>
           </w:r>
           <w:r>
             <w:fldChar w:fldCharType="end"/>
@@ -790,7 +1151,7 @@
             <w:fldChar w:fldCharType="begin"/>
           </w:r>
           <w:r>
-            <w:instrText xml:space="preserve"> HYPERLINK \l _Toc7243 </w:instrText>
+            <w:instrText xml:space="preserve"> HYPERLINK \l _Toc14451 </w:instrText>
           </w:r>
           <w:r>
             <w:fldChar w:fldCharType="separate"/>
@@ -799,7 +1160,7 @@
             <w:rPr>
               <w:rFonts w:ascii="黑体" w:hAnsi="黑体" w:eastAsia="黑体" w:cs="黑体"/>
             </w:rPr>
-            <w:t>2  系统概述</w:t>
+            <w:t>4  模块详细设计</w:t>
           </w:r>
           <w:r>
             <w:tab/>
@@ -808,13 +1169,13 @@
             <w:fldChar w:fldCharType="begin"/>
           </w:r>
           <w:r>
-            <w:instrText xml:space="preserve"> PAGEREF _Toc7243 \h </w:instrText>
+            <w:instrText xml:space="preserve"> PAGEREF _Toc14451 \h </w:instrText>
           </w:r>
           <w:r>
             <w:fldChar w:fldCharType="separate"/>
           </w:r>
           <w:r>
-            <w:t>7</w:t>
+            <w:t>10</w:t>
           </w:r>
           <w:r>
             <w:fldChar w:fldCharType="end"/>
@@ -834,7 +1195,7 @@
             <w:fldChar w:fldCharType="begin"/>
           </w:r>
           <w:r>
-            <w:instrText xml:space="preserve"> HYPERLINK \l _Toc8382 </w:instrText>
+            <w:instrText xml:space="preserve"> HYPERLINK \l _Toc18719 </w:instrText>
           </w:r>
           <w:r>
             <w:fldChar w:fldCharType="separate"/>
@@ -843,7 +1204,7 @@
             <w:rPr>
               <w:rFonts w:ascii="黑体" w:hAnsi="黑体" w:eastAsia="黑体" w:cs="黑体"/>
             </w:rPr>
-            <w:t>2.1 硬件平台</w:t>
+            <w:t>4.1 启动与系统调度</w:t>
           </w:r>
           <w:r>
             <w:tab/>
@@ -852,13 +1213,13 @@
             <w:fldChar w:fldCharType="begin"/>
           </w:r>
           <w:r>
-            <w:instrText xml:space="preserve"> PAGEREF _Toc8382 \h </w:instrText>
+            <w:instrText xml:space="preserve"> PAGEREF _Toc18719 \h </w:instrText>
           </w:r>
           <w:r>
             <w:fldChar w:fldCharType="separate"/>
           </w:r>
           <w:r>
-            <w:t>7</w:t>
+            <w:t>11</w:t>
           </w:r>
           <w:r>
             <w:fldChar w:fldCharType="end"/>
@@ -878,7 +1239,7 @@
             <w:fldChar w:fldCharType="begin"/>
           </w:r>
           <w:r>
-            <w:instrText xml:space="preserve"> HYPERLINK \l _Toc14063 </w:instrText>
+            <w:instrText xml:space="preserve"> HYPERLINK \l _Toc27471 </w:instrText>
           </w:r>
           <w:r>
             <w:fldChar w:fldCharType="separate"/>
@@ -887,7 +1248,7 @@
             <w:rPr>
               <w:rFonts w:ascii="黑体" w:hAnsi="黑体" w:eastAsia="黑体" w:cs="黑体"/>
             </w:rPr>
-            <w:t>2.2 软件运行模型</w:t>
+            <w:t>4.2 LCD 显示</w:t>
           </w:r>
           <w:r>
             <w:tab/>
@@ -896,13 +1257,13 @@
             <w:fldChar w:fldCharType="begin"/>
           </w:r>
           <w:r>
-            <w:instrText xml:space="preserve"> PAGEREF _Toc14063 \h </w:instrText>
+            <w:instrText xml:space="preserve"> PAGEREF _Toc27471 \h </w:instrText>
           </w:r>
           <w:r>
             <w:fldChar w:fldCharType="separate"/>
           </w:r>
           <w:r>
-            <w:t>8</w:t>
+            <w:t>12</w:t>
           </w:r>
           <w:r>
             <w:fldChar w:fldCharType="end"/>
@@ -922,7 +1283,7 @@
             <w:fldChar w:fldCharType="begin"/>
           </w:r>
           <w:r>
-            <w:instrText xml:space="preserve"> HYPERLINK \l _Toc2030 </w:instrText>
+            <w:instrText xml:space="preserve"> HYPERLINK \l _Toc13847 </w:instrText>
           </w:r>
           <w:r>
             <w:fldChar w:fldCharType="separate"/>
@@ -931,7 +1292,7 @@
             <w:rPr>
               <w:rFonts w:ascii="黑体" w:hAnsi="黑体" w:eastAsia="黑体" w:cs="黑体"/>
             </w:rPr>
-            <w:t>2.3 分层架构</w:t>
+            <w:t>4.3 输入扫描与事件</w:t>
           </w:r>
           <w:r>
             <w:tab/>
@@ -940,13 +1301,321 @@
             <w:fldChar w:fldCharType="begin"/>
           </w:r>
           <w:r>
-            <w:instrText xml:space="preserve"> PAGEREF _Toc2030 \h </w:instrText>
+            <w:instrText xml:space="preserve"> PAGEREF _Toc13847 \h </w:instrText>
           </w:r>
           <w:r>
             <w:fldChar w:fldCharType="separate"/>
           </w:r>
           <w:r>
-            <w:t>8</w:t>
+            <w:t>12</w:t>
+          </w:r>
+          <w:r>
+            <w:fldChar w:fldCharType="end"/>
+          </w:r>
+          <w:r>
+            <w:fldChar w:fldCharType="end"/>
+          </w:r>
+        </w:p>
+        <w:p>
+          <w:pPr>
+            <w:pStyle w:val="29"/>
+            <w:tabs>
+              <w:tab w:val="right" w:leader="dot" w:pos="9360"/>
+            </w:tabs>
+          </w:pPr>
+          <w:r>
+            <w:fldChar w:fldCharType="begin"/>
+          </w:r>
+          <w:r>
+            <w:instrText xml:space="preserve"> HYPERLINK \l _Toc30696 </w:instrText>
+          </w:r>
+          <w:r>
+            <w:fldChar w:fldCharType="separate"/>
+          </w:r>
+          <w:r>
+            <w:rPr>
+              <w:rFonts w:ascii="黑体" w:hAnsi="黑体" w:eastAsia="黑体" w:cs="黑体"/>
+            </w:rPr>
+            <w:t>4.4 EEPROM 与参数系统</w:t>
+          </w:r>
+          <w:r>
+            <w:tab/>
+          </w:r>
+          <w:r>
+            <w:fldChar w:fldCharType="begin"/>
+          </w:r>
+          <w:r>
+            <w:instrText xml:space="preserve"> PAGEREF _Toc30696 \h </w:instrText>
+          </w:r>
+          <w:r>
+            <w:fldChar w:fldCharType="separate"/>
+          </w:r>
+          <w:r>
+            <w:t>13</w:t>
+          </w:r>
+          <w:r>
+            <w:fldChar w:fldCharType="end"/>
+          </w:r>
+          <w:r>
+            <w:fldChar w:fldCharType="end"/>
+          </w:r>
+        </w:p>
+        <w:p>
+          <w:pPr>
+            <w:pStyle w:val="29"/>
+            <w:tabs>
+              <w:tab w:val="right" w:leader="dot" w:pos="9360"/>
+            </w:tabs>
+          </w:pPr>
+          <w:r>
+            <w:fldChar w:fldCharType="begin"/>
+          </w:r>
+          <w:r>
+            <w:instrText xml:space="preserve"> HYPERLINK \l _Toc26987 </w:instrText>
+          </w:r>
+          <w:r>
+            <w:fldChar w:fldCharType="separate"/>
+          </w:r>
+          <w:r>
+            <w:rPr>
+              <w:rFonts w:ascii="黑体" w:hAnsi="黑体" w:eastAsia="黑体" w:cs="黑体"/>
+            </w:rPr>
+            <w:t>4.5 ADC 数据采集</w:t>
+          </w:r>
+          <w:r>
+            <w:tab/>
+          </w:r>
+          <w:r>
+            <w:fldChar w:fldCharType="begin"/>
+          </w:r>
+          <w:r>
+            <w:instrText xml:space="preserve"> PAGEREF _Toc26987 \h </w:instrText>
+          </w:r>
+          <w:r>
+            <w:fldChar w:fldCharType="separate"/>
+          </w:r>
+          <w:r>
+            <w:t>13</w:t>
+          </w:r>
+          <w:r>
+            <w:fldChar w:fldCharType="end"/>
+          </w:r>
+          <w:r>
+            <w:fldChar w:fldCharType="end"/>
+          </w:r>
+        </w:p>
+        <w:p>
+          <w:pPr>
+            <w:pStyle w:val="29"/>
+            <w:tabs>
+              <w:tab w:val="right" w:leader="dot" w:pos="9360"/>
+            </w:tabs>
+          </w:pPr>
+          <w:r>
+            <w:fldChar w:fldCharType="begin"/>
+          </w:r>
+          <w:r>
+            <w:instrText xml:space="preserve"> HYPERLINK \l _Toc22447 </w:instrText>
+          </w:r>
+          <w:r>
+            <w:fldChar w:fldCharType="separate"/>
+          </w:r>
+          <w:r>
+            <w:rPr>
+              <w:rFonts w:ascii="黑体" w:hAnsi="黑体" w:eastAsia="黑体" w:cs="黑体"/>
+            </w:rPr>
+            <w:t>4.6 状态机与菜单</w:t>
+          </w:r>
+          <w:r>
+            <w:tab/>
+          </w:r>
+          <w:r>
+            <w:fldChar w:fldCharType="begin"/>
+          </w:r>
+          <w:r>
+            <w:instrText xml:space="preserve"> PAGEREF _Toc22447 \h </w:instrText>
+          </w:r>
+          <w:r>
+            <w:fldChar w:fldCharType="separate"/>
+          </w:r>
+          <w:r>
+            <w:t>14</w:t>
+          </w:r>
+          <w:r>
+            <w:fldChar w:fldCharType="end"/>
+          </w:r>
+          <w:r>
+            <w:fldChar w:fldCharType="end"/>
+          </w:r>
+        </w:p>
+        <w:p>
+          <w:pPr>
+            <w:pStyle w:val="29"/>
+            <w:tabs>
+              <w:tab w:val="right" w:leader="dot" w:pos="9360"/>
+            </w:tabs>
+          </w:pPr>
+          <w:r>
+            <w:fldChar w:fldCharType="begin"/>
+          </w:r>
+          <w:r>
+            <w:instrText xml:space="preserve"> HYPERLINK \l _Toc19817 </w:instrText>
+          </w:r>
+          <w:r>
+            <w:fldChar w:fldCharType="separate"/>
+          </w:r>
+          <w:r>
+            <w:rPr>
+              <w:rFonts w:ascii="黑体" w:hAnsi="黑体" w:eastAsia="黑体" w:cs="黑体"/>
+            </w:rPr>
+            <w:t>4.7 UART3 与 Modbus-RTU</w:t>
+          </w:r>
+          <w:r>
+            <w:tab/>
+          </w:r>
+          <w:r>
+            <w:fldChar w:fldCharType="begin"/>
+          </w:r>
+          <w:r>
+            <w:instrText xml:space="preserve"> PAGEREF _Toc19817 \h </w:instrText>
+          </w:r>
+          <w:r>
+            <w:fldChar w:fldCharType="separate"/>
+          </w:r>
+          <w:r>
+            <w:t>14</w:t>
+          </w:r>
+          <w:r>
+            <w:fldChar w:fldCharType="end"/>
+          </w:r>
+          <w:r>
+            <w:fldChar w:fldCharType="end"/>
+          </w:r>
+        </w:p>
+        <w:p>
+          <w:pPr>
+            <w:pStyle w:val="29"/>
+            <w:tabs>
+              <w:tab w:val="right" w:leader="dot" w:pos="9360"/>
+            </w:tabs>
+          </w:pPr>
+          <w:r>
+            <w:fldChar w:fldCharType="begin"/>
+          </w:r>
+          <w:r>
+            <w:instrText xml:space="preserve"> HYPERLINK \l _Toc20437 </w:instrText>
+          </w:r>
+          <w:r>
+            <w:fldChar w:fldCharType="separate"/>
+          </w:r>
+          <w:r>
+            <w:rPr>
+              <w:rFonts w:ascii="黑体" w:hAnsi="黑体" w:eastAsia="黑体" w:cs="黑体"/>
+            </w:rPr>
+            <w:t>4.8 输出级与触发时序</w:t>
+          </w:r>
+          <w:r>
+            <w:tab/>
+          </w:r>
+          <w:r>
+            <w:fldChar w:fldCharType="begin"/>
+          </w:r>
+          <w:r>
+            <w:instrText xml:space="preserve"> PAGEREF _Toc20437 \h </w:instrText>
+          </w:r>
+          <w:r>
+            <w:fldChar w:fldCharType="separate"/>
+          </w:r>
+          <w:r>
+            <w:t>15</w:t>
+          </w:r>
+          <w:r>
+            <w:fldChar w:fldCharType="end"/>
+          </w:r>
+          <w:r>
+            <w:fldChar w:fldCharType="end"/>
+          </w:r>
+        </w:p>
+        <w:p>
+          <w:pPr>
+            <w:pStyle w:val="29"/>
+            <w:tabs>
+              <w:tab w:val="right" w:leader="dot" w:pos="9360"/>
+            </w:tabs>
+          </w:pPr>
+          <w:r>
+            <w:fldChar w:fldCharType="begin"/>
+          </w:r>
+          <w:r>
+            <w:instrText xml:space="preserve"> HYPERLINK \l _Toc28215 </w:instrText>
+          </w:r>
+          <w:r>
+            <w:fldChar w:fldCharType="separate"/>
+          </w:r>
+          <w:r>
+            <w:rPr>
+              <w:rFonts w:ascii="黑体" w:hAnsi="黑体" w:eastAsia="黑体" w:cs="黑体"/>
+            </w:rPr>
+            <w:t>4.9 闭环控制</w:t>
+          </w:r>
+          <w:r>
+            <w:tab/>
+          </w:r>
+          <w:r>
+            <w:fldChar w:fldCharType="begin"/>
+          </w:r>
+          <w:r>
+            <w:instrText xml:space="preserve"> PAGEREF _Toc28215 \h </w:instrText>
+          </w:r>
+          <w:r>
+            <w:fldChar w:fldCharType="separate"/>
+          </w:r>
+          <w:r>
+            <w:t>15</w:t>
+          </w:r>
+          <w:r>
+            <w:fldChar w:fldCharType="end"/>
+          </w:r>
+          <w:r>
+            <w:fldChar w:fldCharType="end"/>
+          </w:r>
+        </w:p>
+        <w:p>
+          <w:pPr>
+            <w:pStyle w:val="29"/>
+            <w:tabs>
+              <w:tab w:val="right" w:leader="dot" w:pos="9360"/>
+            </w:tabs>
+          </w:pPr>
+          <w:r>
+            <w:fldChar w:fldCharType="begin"/>
+          </w:r>
+          <w:r>
+            <w:instrText xml:space="preserve"> HYPERLINK \l _Toc28885 </w:instrText>
+          </w:r>
+          <w:r>
+            <w:fldChar w:fldCharType="separate"/>
+          </w:r>
+          <w:r>
+            <w:rPr>
+              <w:rFonts w:ascii="黑体" w:hAnsi="黑体" w:eastAsia="黑体" w:cs="黑体"/>
+            </w:rPr>
+            <w:t>4.10 继电器、指示灯与设备识别</w:t>
+          </w:r>
+          <w:r>
+            <w:tab/>
+          </w:r>
+          <w:r>
+            <w:fldChar w:fldCharType="begin"/>
+          </w:r>
+          <w:r>
+            <w:instrText xml:space="preserve"> PAGEREF _Toc28885 \h </w:instrText>
+          </w:r>
+          <w:r>
+            <w:fldChar w:fldCharType="separate"/>
+          </w:r>
+          <w:r>
+            <w:t>16</w:t>
           </w:r>
           <w:r>
             <w:fldChar w:fldCharType="end"/>
@@ -966,7 +1635,7 @@
             <w:fldChar w:fldCharType="begin"/>
           </w:r>
           <w:r>
-            <w:instrText xml:space="preserve"> HYPERLINK \l _Toc8105 </w:instrText>
+            <w:instrText xml:space="preserve"> HYPERLINK \l _Toc9116 </w:instrText>
           </w:r>
           <w:r>
             <w:fldChar w:fldCharType="separate"/>
@@ -975,7 +1644,7 @@
             <w:rPr>
               <w:rFonts w:ascii="黑体" w:hAnsi="黑体" w:eastAsia="黑体" w:cs="黑体"/>
             </w:rPr>
-            <w:t>3  软件总体设计</w:t>
+            <w:t>5  数据与参数设计</w:t>
           </w:r>
           <w:r>
             <w:tab/>
@@ -984,13 +1653,13 @@
             <w:fldChar w:fldCharType="begin"/>
           </w:r>
           <w:r>
-            <w:instrText xml:space="preserve"> PAGEREF _Toc8105 \h </w:instrText>
+            <w:instrText xml:space="preserve"> PAGEREF _Toc9116 \h </w:instrText>
           </w:r>
           <w:r>
             <w:fldChar w:fldCharType="separate"/>
           </w:r>
           <w:r>
-            <w:t>9</w:t>
+            <w:t>16</w:t>
           </w:r>
           <w:r>
             <w:fldChar w:fldCharType="end"/>
@@ -1010,7 +1679,7 @@
             <w:fldChar w:fldCharType="begin"/>
           </w:r>
           <w:r>
-            <w:instrText xml:space="preserve"> HYPERLINK \l _Toc10240 </w:instrText>
+            <w:instrText xml:space="preserve"> HYPERLINK \l _Toc8078 </w:instrText>
           </w:r>
           <w:r>
             <w:fldChar w:fldCharType="separate"/>
@@ -1019,7 +1688,7 @@
             <w:rPr>
               <w:rFonts w:ascii="黑体" w:hAnsi="黑体" w:eastAsia="黑体" w:cs="黑体"/>
             </w:rPr>
-            <w:t>3.1 启动流程</w:t>
+            <w:t>5.1 全局数据分类</w:t>
           </w:r>
           <w:r>
             <w:tab/>
@@ -1028,13 +1697,13 @@
             <w:fldChar w:fldCharType="begin"/>
           </w:r>
           <w:r>
-            <w:instrText xml:space="preserve"> PAGEREF _Toc10240 \h </w:instrText>
+            <w:instrText xml:space="preserve"> PAGEREF _Toc8078 \h </w:instrText>
           </w:r>
           <w:r>
             <w:fldChar w:fldCharType="separate"/>
           </w:r>
           <w:r>
-            <w:t>9</w:t>
+            <w:t>16</w:t>
           </w:r>
           <w:r>
             <w:fldChar w:fldCharType="end"/>
@@ -1054,7 +1723,7 @@
             <w:fldChar w:fldCharType="begin"/>
           </w:r>
           <w:r>
-            <w:instrText xml:space="preserve"> HYPERLINK \l _Toc4437 </w:instrText>
+            <w:instrText xml:space="preserve"> HYPERLINK \l _Toc25174 </w:instrText>
           </w:r>
           <w:r>
             <w:fldChar w:fldCharType="separate"/>
@@ -1063,7 +1732,7 @@
             <w:rPr>
               <w:rFonts w:ascii="黑体" w:hAnsi="黑体" w:eastAsia="黑体" w:cs="黑体"/>
             </w:rPr>
-            <w:t>3.2 内存布局</w:t>
+            <w:t>5.2 基本参数</w:t>
           </w:r>
           <w:r>
             <w:tab/>
@@ -1072,13 +1741,13 @@
             <w:fldChar w:fldCharType="begin"/>
           </w:r>
           <w:r>
-            <w:instrText xml:space="preserve"> PAGEREF _Toc4437 \h </w:instrText>
+            <w:instrText xml:space="preserve"> PAGEREF _Toc25174 \h </w:instrText>
           </w:r>
           <w:r>
             <w:fldChar w:fldCharType="separate"/>
           </w:r>
           <w:r>
-            <w:t>9</w:t>
+            <w:t>16</w:t>
           </w:r>
           <w:r>
             <w:fldChar w:fldCharType="end"/>
@@ -1098,7 +1767,7 @@
             <w:fldChar w:fldCharType="begin"/>
           </w:r>
           <w:r>
-            <w:instrText xml:space="preserve"> HYPERLINK \l _Toc15225 </w:instrText>
+            <w:instrText xml:space="preserve"> HYPERLINK \l _Toc23509 </w:instrText>
           </w:r>
           <w:r>
             <w:fldChar w:fldCharType="separate"/>
@@ -1107,7 +1776,7 @@
             <w:rPr>
               <w:rFonts w:ascii="黑体" w:hAnsi="黑体" w:eastAsia="黑体" w:cs="黑体"/>
             </w:rPr>
-            <w:t>3.3 中断体系</w:t>
+            <w:t>5.3 保护参数</w:t>
           </w:r>
           <w:r>
             <w:tab/>
@@ -1116,13 +1785,13 @@
             <w:fldChar w:fldCharType="begin"/>
           </w:r>
           <w:r>
-            <w:instrText xml:space="preserve"> PAGEREF _Toc15225 \h </w:instrText>
+            <w:instrText xml:space="preserve"> PAGEREF _Toc23509 \h </w:instrText>
           </w:r>
           <w:r>
             <w:fldChar w:fldCharType="separate"/>
           </w:r>
           <w:r>
-            <w:t>10</w:t>
+            <w:t>17</w:t>
           </w:r>
           <w:r>
             <w:fldChar w:fldCharType="end"/>
@@ -1142,7 +1811,7 @@
             <w:fldChar w:fldCharType="begin"/>
           </w:r>
           <w:r>
-            <w:instrText xml:space="preserve"> HYPERLINK \l _Toc787 </w:instrText>
+            <w:instrText xml:space="preserve"> HYPERLINK \l _Toc14532 </w:instrText>
           </w:r>
           <w:r>
             <w:fldChar w:fldCharType="separate"/>
@@ -1151,7 +1820,7 @@
             <w:rPr>
               <w:rFonts w:ascii="黑体" w:hAnsi="黑体" w:eastAsia="黑体" w:cs="黑体"/>
             </w:rPr>
-            <w:t>3.4 安全状态</w:t>
+            <w:t>5.4 参数修改一致性</w:t>
           </w:r>
           <w:r>
             <w:tab/>
@@ -1160,13 +1829,13 @@
             <w:fldChar w:fldCharType="begin"/>
           </w:r>
           <w:r>
-            <w:instrText xml:space="preserve"> PAGEREF _Toc787 \h </w:instrText>
+            <w:instrText xml:space="preserve"> PAGEREF _Toc14532 \h </w:instrText>
           </w:r>
           <w:r>
             <w:fldChar w:fldCharType="separate"/>
           </w:r>
           <w:r>
-            <w:t>10</w:t>
+            <w:t>18</w:t>
           </w:r>
           <w:r>
             <w:fldChar w:fldCharType="end"/>
@@ -1186,7 +1855,7 @@
             <w:fldChar w:fldCharType="begin"/>
           </w:r>
           <w:r>
-            <w:instrText xml:space="preserve"> HYPERLINK \l _Toc12516 </w:instrText>
+            <w:instrText xml:space="preserve"> HYPERLINK \l _Toc22756 </w:instrText>
           </w:r>
           <w:r>
             <w:fldChar w:fldCharType="separate"/>
@@ -1195,7 +1864,7 @@
             <w:rPr>
               <w:rFonts w:ascii="黑体" w:hAnsi="黑体" w:eastAsia="黑体" w:cs="黑体"/>
             </w:rPr>
-            <w:t>4  模块详细设计</w:t>
+            <w:t>6  外部接口设计</w:t>
           </w:r>
           <w:r>
             <w:tab/>
@@ -1204,13 +1873,13 @@
             <w:fldChar w:fldCharType="begin"/>
           </w:r>
           <w:r>
-            <w:instrText xml:space="preserve"> PAGEREF _Toc12516 \h </w:instrText>
+            <w:instrText xml:space="preserve"> PAGEREF _Toc22756 \h </w:instrText>
           </w:r>
           <w:r>
             <w:fldChar w:fldCharType="separate"/>
           </w:r>
           <w:r>
-            <w:t>10</w:t>
+            <w:t>18</w:t>
           </w:r>
           <w:r>
             <w:fldChar w:fldCharType="end"/>
@@ -1230,7 +1899,7 @@
             <w:fldChar w:fldCharType="begin"/>
           </w:r>
           <w:r>
-            <w:instrText xml:space="preserve"> HYPERLINK \l _Toc21894 </w:instrText>
+            <w:instrText xml:space="preserve"> HYPERLINK \l _Toc23081 </w:instrText>
           </w:r>
           <w:r>
             <w:fldChar w:fldCharType="separate"/>
@@ -1239,7 +1908,7 @@
             <w:rPr>
               <w:rFonts w:ascii="黑体" w:hAnsi="黑体" w:eastAsia="黑体" w:cs="黑体"/>
             </w:rPr>
-            <w:t>4.1 启动与系统调度</w:t>
+            <w:t>6.1 GPIO 接口</w:t>
           </w:r>
           <w:r>
             <w:tab/>
@@ -1248,13 +1917,13 @@
             <w:fldChar w:fldCharType="begin"/>
           </w:r>
           <w:r>
-            <w:instrText xml:space="preserve"> PAGEREF _Toc21894 \h </w:instrText>
+            <w:instrText xml:space="preserve"> PAGEREF _Toc23081 \h </w:instrText>
           </w:r>
           <w:r>
             <w:fldChar w:fldCharType="separate"/>
           </w:r>
           <w:r>
-            <w:t>11</w:t>
+            <w:t>18</w:t>
           </w:r>
           <w:r>
             <w:fldChar w:fldCharType="end"/>
@@ -1274,7 +1943,7 @@
             <w:fldChar w:fldCharType="begin"/>
           </w:r>
           <w:r>
-            <w:instrText xml:space="preserve"> HYPERLINK \l _Toc27024 </w:instrText>
+            <w:instrText xml:space="preserve"> HYPERLINK \l _Toc24095 </w:instrText>
           </w:r>
           <w:r>
             <w:fldChar w:fldCharType="separate"/>
@@ -1283,7 +1952,7 @@
             <w:rPr>
               <w:rFonts w:ascii="黑体" w:hAnsi="黑体" w:eastAsia="黑体" w:cs="黑体"/>
             </w:rPr>
-            <w:t>4.2 LCD 显示</w:t>
+            <w:t>6.2 Modbus 常用寄存器</w:t>
           </w:r>
           <w:r>
             <w:tab/>
@@ -1292,13 +1961,13 @@
             <w:fldChar w:fldCharType="begin"/>
           </w:r>
           <w:r>
-            <w:instrText xml:space="preserve"> PAGEREF _Toc27024 \h </w:instrText>
+            <w:instrText xml:space="preserve"> PAGEREF _Toc24095 \h </w:instrText>
           </w:r>
           <w:r>
             <w:fldChar w:fldCharType="separate"/>
           </w:r>
           <w:r>
-            <w:t>12</w:t>
+            <w:t>19</w:t>
           </w:r>
           <w:r>
             <w:fldChar w:fldCharType="end"/>
@@ -1318,7 +1987,7 @@
             <w:fldChar w:fldCharType="begin"/>
           </w:r>
           <w:r>
-            <w:instrText xml:space="preserve"> HYPERLINK \l _Toc17170 </w:instrText>
+            <w:instrText xml:space="preserve"> HYPERLINK \l _Toc29917 </w:instrText>
           </w:r>
           <w:r>
             <w:fldChar w:fldCharType="separate"/>
@@ -1327,7 +1996,7 @@
             <w:rPr>
               <w:rFonts w:ascii="黑体" w:hAnsi="黑体" w:eastAsia="黑体" w:cs="黑体"/>
             </w:rPr>
-            <w:t>4.3 输入扫描与事件</w:t>
+            <w:t>6.3 LCD 与本地操作</w:t>
           </w:r>
           <w:r>
             <w:tab/>
@@ -1336,13 +2005,57 @@
             <w:fldChar w:fldCharType="begin"/>
           </w:r>
           <w:r>
-            <w:instrText xml:space="preserve"> PAGEREF _Toc17170 \h </w:instrText>
+            <w:instrText xml:space="preserve"> PAGEREF _Toc29917 \h </w:instrText>
           </w:r>
           <w:r>
             <w:fldChar w:fldCharType="separate"/>
           </w:r>
           <w:r>
-            <w:t>12</w:t>
+            <w:t>19</w:t>
+          </w:r>
+          <w:r>
+            <w:fldChar w:fldCharType="end"/>
+          </w:r>
+          <w:r>
+            <w:fldChar w:fldCharType="end"/>
+          </w:r>
+        </w:p>
+        <w:p>
+          <w:pPr>
+            <w:pStyle w:val="26"/>
+            <w:tabs>
+              <w:tab w:val="right" w:leader="dot" w:pos="9360"/>
+            </w:tabs>
+          </w:pPr>
+          <w:r>
+            <w:fldChar w:fldCharType="begin"/>
+          </w:r>
+          <w:r>
+            <w:instrText xml:space="preserve"> HYPERLINK \l _Toc23287 </w:instrText>
+          </w:r>
+          <w:r>
+            <w:fldChar w:fldCharType="separate"/>
+          </w:r>
+          <w:r>
+            <w:rPr>
+              <w:rFonts w:ascii="黑体" w:hAnsi="黑体" w:eastAsia="黑体" w:cs="黑体"/>
+            </w:rPr>
+            <w:t>7  控制流程设计</w:t>
+          </w:r>
+          <w:r>
+            <w:tab/>
+          </w:r>
+          <w:r>
+            <w:fldChar w:fldCharType="begin"/>
+          </w:r>
+          <w:r>
+            <w:instrText xml:space="preserve"> PAGEREF _Toc23287 \h </w:instrText>
+          </w:r>
+          <w:r>
+            <w:fldChar w:fldCharType="separate"/>
+          </w:r>
+          <w:r>
+            <w:t>19</w:t>
           </w:r>
           <w:r>
             <w:fldChar w:fldCharType="end"/>
@@ -1362,7 +2075,7 @@
             <w:fldChar w:fldCharType="begin"/>
           </w:r>
           <w:r>
-            <w:instrText xml:space="preserve"> HYPERLINK \l _Toc25435 </w:instrText>
+            <w:instrText xml:space="preserve"> HYPERLINK \l _Toc13086 </w:instrText>
           </w:r>
           <w:r>
             <w:fldChar w:fldCharType="separate"/>
@@ -1371,7 +2084,7 @@
             <w:rPr>
               <w:rFonts w:ascii="黑体" w:hAnsi="黑体" w:eastAsia="黑体" w:cs="黑体"/>
             </w:rPr>
-            <w:t>4.4 EEPROM 与参数系统</w:t>
+            <w:t>7.1 运行状态转换</w:t>
           </w:r>
           <w:r>
             <w:tab/>
@@ -1380,13 +2093,13 @@
             <w:fldChar w:fldCharType="begin"/>
           </w:r>
           <w:r>
-            <w:instrText xml:space="preserve"> PAGEREF _Toc25435 \h </w:instrText>
+            <w:instrText xml:space="preserve"> PAGEREF _Toc13086 \h </w:instrText>
           </w:r>
           <w:r>
             <w:fldChar w:fldCharType="separate"/>
           </w:r>
           <w:r>
-            <w:t>13</w:t>
+            <w:t>19</w:t>
           </w:r>
           <w:r>
             <w:fldChar w:fldCharType="end"/>
@@ -1406,7 +2119,7 @@
             <w:fldChar w:fldCharType="begin"/>
           </w:r>
           <w:r>
-            <w:instrText xml:space="preserve"> HYPERLINK \l _Toc29437 </w:instrText>
+            <w:instrText xml:space="preserve"> HYPERLINK \l _Toc12024 </w:instrText>
           </w:r>
           <w:r>
             <w:fldChar w:fldCharType="separate"/>
@@ -1415,7 +2128,7 @@
             <w:rPr>
               <w:rFonts w:ascii="黑体" w:hAnsi="黑体" w:eastAsia="黑体" w:cs="黑体"/>
             </w:rPr>
-            <w:t>4.5 ADC 数据采集</w:t>
+            <w:t>7.2 控制来源</w:t>
           </w:r>
           <w:r>
             <w:tab/>
@@ -1424,13 +2137,13 @@
             <w:fldChar w:fldCharType="begin"/>
           </w:r>
           <w:r>
-            <w:instrText xml:space="preserve"> PAGEREF _Toc29437 \h </w:instrText>
+            <w:instrText xml:space="preserve"> PAGEREF _Toc12024 \h </w:instrText>
           </w:r>
           <w:r>
             <w:fldChar w:fldCharType="separate"/>
           </w:r>
           <w:r>
-            <w:t>13</w:t>
+            <w:t>20</w:t>
           </w:r>
           <w:r>
             <w:fldChar w:fldCharType="end"/>
@@ -1450,7 +2163,7 @@
             <w:fldChar w:fldCharType="begin"/>
           </w:r>
           <w:r>
-            <w:instrText xml:space="preserve"> HYPERLINK \l _Toc19920 </w:instrText>
+            <w:instrText xml:space="preserve"> HYPERLINK \l _Toc873 </w:instrText>
           </w:r>
           <w:r>
             <w:fldChar w:fldCharType="separate"/>
@@ -1459,7 +2172,7 @@
             <w:rPr>
               <w:rFonts w:ascii="黑体" w:hAnsi="黑体" w:eastAsia="黑体" w:cs="黑体"/>
             </w:rPr>
-            <w:t>4.6 状态机与菜单</w:t>
+            <w:t>7.3 软起动与软停止</w:t>
           </w:r>
           <w:r>
             <w:tab/>
@@ -1468,13 +2181,13 @@
             <w:fldChar w:fldCharType="begin"/>
           </w:r>
           <w:r>
-            <w:instrText xml:space="preserve"> PAGEREF _Toc19920 \h </w:instrText>
+            <w:instrText xml:space="preserve"> PAGEREF _Toc873 \h </w:instrText>
           </w:r>
           <w:r>
             <w:fldChar w:fldCharType="separate"/>
           </w:r>
           <w:r>
-            <w:t>14</w:t>
+            <w:t>20</w:t>
           </w:r>
           <w:r>
             <w:fldChar w:fldCharType="end"/>
@@ -1494,7 +2207,7 @@
             <w:fldChar w:fldCharType="begin"/>
           </w:r>
           <w:r>
-            <w:instrText xml:space="preserve"> HYPERLINK \l _Toc20125 </w:instrText>
+            <w:instrText xml:space="preserve"> HYPERLINK \l _Toc28491 </w:instrText>
           </w:r>
           <w:r>
             <w:fldChar w:fldCharType="separate"/>
@@ -1503,7 +2216,7 @@
             <w:rPr>
               <w:rFonts w:ascii="黑体" w:hAnsi="黑体" w:eastAsia="黑体" w:cs="黑体"/>
             </w:rPr>
-            <w:t>4.7 UART3 与 Modbus-RTU</w:t>
+            <w:t>7.4 故障与保护</w:t>
           </w:r>
           <w:r>
             <w:tab/>
@@ -1512,13 +2225,57 @@
             <w:fldChar w:fldCharType="begin"/>
           </w:r>
           <w:r>
-            <w:instrText xml:space="preserve"> PAGEREF _Toc20125 \h </w:instrText>
+            <w:instrText xml:space="preserve"> PAGEREF _Toc28491 \h </w:instrText>
           </w:r>
           <w:r>
             <w:fldChar w:fldCharType="separate"/>
           </w:r>
           <w:r>
-            <w:t>14</w:t>
+            <w:t>20</w:t>
+          </w:r>
+          <w:r>
+            <w:fldChar w:fldCharType="end"/>
+          </w:r>
+          <w:r>
+            <w:fldChar w:fldCharType="end"/>
+          </w:r>
+        </w:p>
+        <w:p>
+          <w:pPr>
+            <w:pStyle w:val="26"/>
+            <w:tabs>
+              <w:tab w:val="right" w:leader="dot" w:pos="9360"/>
+            </w:tabs>
+          </w:pPr>
+          <w:r>
+            <w:fldChar w:fldCharType="begin"/>
+          </w:r>
+          <w:r>
+            <w:instrText xml:space="preserve"> HYPERLINK \l _Toc27767 </w:instrText>
+          </w:r>
+          <w:r>
+            <w:fldChar w:fldCharType="separate"/>
+          </w:r>
+          <w:r>
+            <w:rPr>
+              <w:rFonts w:ascii="黑体" w:hAnsi="黑体" w:eastAsia="黑体" w:cs="黑体"/>
+            </w:rPr>
+            <w:t>8  工程结构与编码规范</w:t>
+          </w:r>
+          <w:r>
+            <w:tab/>
+          </w:r>
+          <w:r>
+            <w:fldChar w:fldCharType="begin"/>
+          </w:r>
+          <w:r>
+            <w:instrText xml:space="preserve"> PAGEREF _Toc27767 \h </w:instrText>
+          </w:r>
+          <w:r>
+            <w:fldChar w:fldCharType="separate"/>
+          </w:r>
+          <w:r>
+            <w:t>21</w:t>
           </w:r>
           <w:r>
             <w:fldChar w:fldCharType="end"/>
@@ -1538,7 +2295,7 @@
             <w:fldChar w:fldCharType="begin"/>
           </w:r>
           <w:r>
-            <w:instrText xml:space="preserve"> HYPERLINK \l _Toc19734 </w:instrText>
+            <w:instrText xml:space="preserve"> HYPERLINK \l _Toc32043 </w:instrText>
           </w:r>
           <w:r>
             <w:fldChar w:fldCharType="separate"/>
@@ -1547,7 +2304,7 @@
             <w:rPr>
               <w:rFonts w:ascii="黑体" w:hAnsi="黑体" w:eastAsia="黑体" w:cs="黑体"/>
             </w:rPr>
-            <w:t>4.8 输出级与触发时序</w:t>
+            <w:t>8.1 工程目录</w:t>
           </w:r>
           <w:r>
             <w:tab/>
@@ -1556,13 +2313,13 @@
             <w:fldChar w:fldCharType="begin"/>
           </w:r>
           <w:r>
-            <w:instrText xml:space="preserve"> PAGEREF _Toc19734 \h </w:instrText>
+            <w:instrText xml:space="preserve"> PAGEREF _Toc32043 \h </w:instrText>
           </w:r>
           <w:r>
             <w:fldChar w:fldCharType="separate"/>
           </w:r>
           <w:r>
-            <w:t>15</w:t>
+            <w:t>21</w:t>
           </w:r>
           <w:r>
             <w:fldChar w:fldCharType="end"/>
@@ -1582,7 +2339,7 @@
             <w:fldChar w:fldCharType="begin"/>
           </w:r>
           <w:r>
-            <w:instrText xml:space="preserve"> HYPERLINK \l _Toc28924 </w:instrText>
+            <w:instrText xml:space="preserve"> HYPERLINK \l _Toc4697 </w:instrText>
           </w:r>
           <w:r>
             <w:fldChar w:fldCharType="separate"/>
@@ -1591,7 +2348,7 @@
             <w:rPr>
               <w:rFonts w:ascii="黑体" w:hAnsi="黑体" w:eastAsia="黑体" w:cs="黑体"/>
             </w:rPr>
-            <w:t>4.9 闭环控制</w:t>
+            <w:t>8.2 编码规范</w:t>
           </w:r>
           <w:r>
             <w:tab/>
@@ -1600,13 +2357,13 @@
             <w:fldChar w:fldCharType="begin"/>
           </w:r>
           <w:r>
-            <w:instrText xml:space="preserve"> PAGEREF _Toc28924 \h </w:instrText>
+            <w:instrText xml:space="preserve"> PAGEREF _Toc4697 \h </w:instrText>
           </w:r>
           <w:r>
             <w:fldChar w:fldCharType="separate"/>
           </w:r>
           <w:r>
-            <w:t>15</w:t>
+            <w:t>21</w:t>
           </w:r>
           <w:r>
             <w:fldChar w:fldCharType="end"/>
@@ -1626,7 +2383,7 @@
             <w:fldChar w:fldCharType="begin"/>
           </w:r>
           <w:r>
-            <w:instrText xml:space="preserve"> HYPERLINK \l _Toc393 </w:instrText>
+            <w:instrText xml:space="preserve"> HYPERLINK \l _Toc7454 </w:instrText>
           </w:r>
           <w:r>
             <w:fldChar w:fldCharType="separate"/>
@@ -1635,7 +2392,7 @@
             <w:rPr>
               <w:rFonts w:ascii="黑体" w:hAnsi="黑体" w:eastAsia="黑体" w:cs="黑体"/>
             </w:rPr>
-            <w:t>4.10 继电器、指示灯与设备识别</w:t>
+            <w:t>8.3 变更影响分析</w:t>
           </w:r>
           <w:r>
             <w:tab/>
@@ -1644,13 +2401,13 @@
             <w:fldChar w:fldCharType="begin"/>
           </w:r>
           <w:r>
-            <w:instrText xml:space="preserve"> PAGEREF _Toc393 \h </w:instrText>
+            <w:instrText xml:space="preserve"> PAGEREF _Toc7454 \h </w:instrText>
           </w:r>
           <w:r>
             <w:fldChar w:fldCharType="separate"/>
           </w:r>
           <w:r>
-            <w:t>16</w:t>
+            <w:t>21</w:t>
           </w:r>
           <w:r>
             <w:fldChar w:fldCharType="end"/>
@@ -1670,7 +2427,7 @@
             <w:fldChar w:fldCharType="begin"/>
           </w:r>
           <w:r>
-            <w:instrText xml:space="preserve"> HYPERLINK \l _Toc3224 </w:instrText>
+            <w:instrText xml:space="preserve"> HYPERLINK \l _Toc32077 </w:instrText>
           </w:r>
           <w:r>
             <w:fldChar w:fldCharType="separate"/>
@@ -1679,7 +2436,7 @@
             <w:rPr>
               <w:rFonts w:ascii="黑体" w:hAnsi="黑体" w:eastAsia="黑体" w:cs="黑体"/>
             </w:rPr>
-            <w:t>5  数据与参数设计</w:t>
+            <w:t>9  构建与开发环境</w:t>
           </w:r>
           <w:r>
             <w:tab/>
@@ -1688,13 +2445,13 @@
             <w:fldChar w:fldCharType="begin"/>
           </w:r>
           <w:r>
-            <w:instrText xml:space="preserve"> PAGEREF _Toc3224 \h </w:instrText>
+            <w:instrText xml:space="preserve"> PAGEREF _Toc32077 \h </w:instrText>
           </w:r>
           <w:r>
             <w:fldChar w:fldCharType="separate"/>
           </w:r>
           <w:r>
-            <w:t>16</w:t>
+            <w:t>22</w:t>
           </w:r>
           <w:r>
             <w:fldChar w:fldCharType="end"/>
@@ -1714,7 +2471,7 @@
             <w:fldChar w:fldCharType="begin"/>
           </w:r>
           <w:r>
-            <w:instrText xml:space="preserve"> HYPERLINK \l _Toc24823 </w:instrText>
+            <w:instrText xml:space="preserve"> HYPERLINK \l _Toc31995 </w:instrText>
           </w:r>
           <w:r>
             <w:fldChar w:fldCharType="separate"/>
@@ -1723,7 +2480,7 @@
             <w:rPr>
               <w:rFonts w:ascii="黑体" w:hAnsi="黑体" w:eastAsia="黑体" w:cs="黑体"/>
             </w:rPr>
-            <w:t>5.1 全局数据分类</w:t>
+            <w:t>9.1 工具依赖</w:t>
           </w:r>
           <w:r>
             <w:tab/>
@@ -1732,13 +2489,13 @@
             <w:fldChar w:fldCharType="begin"/>
           </w:r>
           <w:r>
-            <w:instrText xml:space="preserve"> PAGEREF _Toc24823 \h </w:instrText>
+            <w:instrText xml:space="preserve"> PAGEREF _Toc31995 \h </w:instrText>
           </w:r>
           <w:r>
             <w:fldChar w:fldCharType="separate"/>
           </w:r>
           <w:r>
-            <w:t>16</w:t>
+            <w:t>22</w:t>
           </w:r>
           <w:r>
             <w:fldChar w:fldCharType="end"/>
@@ -1758,7 +2515,7 @@
             <w:fldChar w:fldCharType="begin"/>
           </w:r>
           <w:r>
-            <w:instrText xml:space="preserve"> HYPERLINK \l _Toc16426 </w:instrText>
+            <w:instrText xml:space="preserve"> HYPERLINK \l _Toc30769 </w:instrText>
           </w:r>
           <w:r>
             <w:fldChar w:fldCharType="separate"/>
@@ -1767,7 +2524,7 @@
             <w:rPr>
               <w:rFonts w:ascii="黑体" w:hAnsi="黑体" w:eastAsia="黑体" w:cs="黑体"/>
             </w:rPr>
-            <w:t>5.2 基本参数</w:t>
+            <w:t>9.2 编译参数</w:t>
           </w:r>
           <w:r>
             <w:tab/>
@@ -1776,13 +2533,13 @@
             <w:fldChar w:fldCharType="begin"/>
           </w:r>
           <w:r>
-            <w:instrText xml:space="preserve"> PAGEREF _Toc16426 \h </w:instrText>
+            <w:instrText xml:space="preserve"> PAGEREF _Toc30769 \h </w:instrText>
           </w:r>
           <w:r>
             <w:fldChar w:fldCharType="separate"/>
           </w:r>
           <w:r>
-            <w:t>16</w:t>
+            <w:t>22</w:t>
           </w:r>
           <w:r>
             <w:fldChar w:fldCharType="end"/>
@@ -1802,7 +2559,7 @@
             <w:fldChar w:fldCharType="begin"/>
           </w:r>
           <w:r>
-            <w:instrText xml:space="preserve"> HYPERLINK \l _Toc5837 </w:instrText>
+            <w:instrText xml:space="preserve"> HYPERLINK \l _Toc18169 </w:instrText>
           </w:r>
           <w:r>
             <w:fldChar w:fldCharType="separate"/>
@@ -1811,7 +2568,7 @@
             <w:rPr>
               <w:rFonts w:ascii="黑体" w:hAnsi="黑体" w:eastAsia="黑体" w:cs="黑体"/>
             </w:rPr>
-            <w:t>5.3 保护参数</w:t>
+            <w:t>9.3 标准构建</w:t>
           </w:r>
           <w:r>
             <w:tab/>
@@ -1820,13 +2577,13 @@
             <w:fldChar w:fldCharType="begin"/>
           </w:r>
           <w:r>
-            <w:instrText xml:space="preserve"> PAGEREF _Toc5837 \h </w:instrText>
+            <w:instrText xml:space="preserve"> PAGEREF _Toc18169 \h </w:instrText>
           </w:r>
           <w:r>
             <w:fldChar w:fldCharType="separate"/>
           </w:r>
           <w:r>
-            <w:t>17</w:t>
+            <w:t>23</w:t>
           </w:r>
           <w:r>
             <w:fldChar w:fldCharType="end"/>
@@ -1846,7 +2603,7 @@
             <w:fldChar w:fldCharType="begin"/>
           </w:r>
           <w:r>
-            <w:instrText xml:space="preserve"> HYPERLINK \l _Toc23194 </w:instrText>
+            <w:instrText xml:space="preserve"> HYPERLINK \l _Toc19412 </w:instrText>
           </w:r>
           <w:r>
             <w:fldChar w:fldCharType="separate"/>
@@ -1855,7 +2612,7 @@
             <w:rPr>
               <w:rFonts w:ascii="黑体" w:hAnsi="黑体" w:eastAsia="黑体" w:cs="黑体"/>
             </w:rPr>
-            <w:t>5.4 参数修改一致性</w:t>
+            <w:t>9.4 构建后检查</w:t>
           </w:r>
           <w:r>
             <w:tab/>
@@ -1864,13 +2621,13 @@
             <w:fldChar w:fldCharType="begin"/>
           </w:r>
           <w:r>
-            <w:instrText xml:space="preserve"> PAGEREF _Toc23194 \h </w:instrText>
+            <w:instrText xml:space="preserve"> PAGEREF _Toc19412 \h </w:instrText>
           </w:r>
           <w:r>
             <w:fldChar w:fldCharType="separate"/>
           </w:r>
           <w:r>
-            <w:t>18</w:t>
+            <w:t>23</w:t>
           </w:r>
           <w:r>
             <w:fldChar w:fldCharType="end"/>
@@ -1890,7 +2647,7 @@
             <w:fldChar w:fldCharType="begin"/>
           </w:r>
           <w:r>
-            <w:instrText xml:space="preserve"> HYPERLINK \l _Toc2757 </w:instrText>
+            <w:instrText xml:space="preserve"> HYPERLINK \l _Toc4701 </w:instrText>
           </w:r>
           <w:r>
             <w:fldChar w:fldCharType="separate"/>
@@ -1899,7 +2656,7 @@
             <w:rPr>
               <w:rFonts w:ascii="黑体" w:hAnsi="黑体" w:eastAsia="黑体" w:cs="黑体"/>
             </w:rPr>
-            <w:t>6  外部接口设计</w:t>
+            <w:t>10  测试与质量保证</w:t>
           </w:r>
           <w:r>
             <w:tab/>
@@ -1908,13 +2665,13 @@
             <w:fldChar w:fldCharType="begin"/>
           </w:r>
           <w:r>
-            <w:instrText xml:space="preserve"> PAGEREF _Toc2757 \h </w:instrText>
+            <w:instrText xml:space="preserve"> PAGEREF _Toc4701 \h </w:instrText>
           </w:r>
           <w:r>
             <w:fldChar w:fldCharType="separate"/>
           </w:r>
           <w:r>
-            <w:t>18</w:t>
+            <w:t>23</w:t>
           </w:r>
           <w:r>
             <w:fldChar w:fldCharType="end"/>
@@ -1934,7 +2691,7 @@
             <w:fldChar w:fldCharType="begin"/>
           </w:r>
           <w:r>
-            <w:instrText xml:space="preserve"> HYPERLINK \l _Toc20353 </w:instrText>
+            <w:instrText xml:space="preserve"> HYPERLINK \l _Toc1384 </w:instrText>
           </w:r>
           <w:r>
             <w:fldChar w:fldCharType="separate"/>
@@ -1943,7 +2700,7 @@
             <w:rPr>
               <w:rFonts w:ascii="黑体" w:hAnsi="黑体" w:eastAsia="黑体" w:cs="黑体"/>
             </w:rPr>
-            <w:t>6.1 GPIO 接口</w:t>
+            <w:t>10.1 测试分层</w:t>
           </w:r>
           <w:r>
             <w:tab/>
@@ -1952,13 +2709,13 @@
             <w:fldChar w:fldCharType="begin"/>
           </w:r>
           <w:r>
-            <w:instrText xml:space="preserve"> PAGEREF _Toc20353 \h </w:instrText>
+            <w:instrText xml:space="preserve"> PAGEREF _Toc1384 \h </w:instrText>
           </w:r>
           <w:r>
             <w:fldChar w:fldCharType="separate"/>
           </w:r>
           <w:r>
-            <w:t>18</w:t>
+            <w:t>23</w:t>
           </w:r>
           <w:r>
             <w:fldChar w:fldCharType="end"/>
@@ -1978,7 +2735,7 @@
             <w:fldChar w:fldCharType="begin"/>
           </w:r>
           <w:r>
-            <w:instrText xml:space="preserve"> HYPERLINK \l _Toc27079 </w:instrText>
+            <w:instrText xml:space="preserve"> HYPERLINK \l _Toc18054 </w:instrText>
           </w:r>
           <w:r>
             <w:fldChar w:fldCharType="separate"/>
@@ -1987,7 +2744,7 @@
             <w:rPr>
               <w:rFonts w:ascii="黑体" w:hAnsi="黑体" w:eastAsia="黑体" w:cs="黑体"/>
             </w:rPr>
-            <w:t>6.2 Modbus 常用寄存器</w:t>
+            <w:t>10.2 自动化测试入口</w:t>
           </w:r>
           <w:r>
             <w:tab/>
@@ -1996,13 +2753,13 @@
             <w:fldChar w:fldCharType="begin"/>
           </w:r>
           <w:r>
-            <w:instrText xml:space="preserve"> PAGEREF _Toc27079 \h </w:instrText>
+            <w:instrText xml:space="preserve"> PAGEREF _Toc18054 \h </w:instrText>
           </w:r>
           <w:r>
             <w:fldChar w:fldCharType="separate"/>
           </w:r>
           <w:r>
-            <w:t>19</w:t>
+            <w:t>24</w:t>
           </w:r>
           <w:r>
             <w:fldChar w:fldCharType="end"/>
@@ -2022,7 +2779,7 @@
             <w:fldChar w:fldCharType="begin"/>
           </w:r>
           <w:r>
-            <w:instrText xml:space="preserve"> HYPERLINK \l _Toc26867 </w:instrText>
+            <w:instrText xml:space="preserve"> HYPERLINK \l _Toc10720 </w:instrText>
           </w:r>
           <w:r>
             <w:fldChar w:fldCharType="separate"/>
@@ -2031,7 +2788,7 @@
             <w:rPr>
               <w:rFonts w:ascii="黑体" w:hAnsi="黑体" w:eastAsia="黑体" w:cs="黑体"/>
             </w:rPr>
-            <w:t>6.3 LCD 与本地操作</w:t>
+            <w:t>10.3 重点测试矩阵</w:t>
           </w:r>
           <w:r>
             <w:tab/>
@@ -2040,13 +2797,57 @@
             <w:fldChar w:fldCharType="begin"/>
           </w:r>
           <w:r>
-            <w:instrText xml:space="preserve"> PAGEREF _Toc26867 \h </w:instrText>
+            <w:instrText xml:space="preserve"> PAGEREF _Toc10720 \h </w:instrText>
           </w:r>
           <w:r>
             <w:fldChar w:fldCharType="separate"/>
           </w:r>
           <w:r>
-            <w:t>19</w:t>
+            <w:t>24</w:t>
+          </w:r>
+          <w:r>
+            <w:fldChar w:fldCharType="end"/>
+          </w:r>
+          <w:r>
+            <w:fldChar w:fldCharType="end"/>
+          </w:r>
+        </w:p>
+        <w:p>
+          <w:pPr>
+            <w:pStyle w:val="29"/>
+            <w:tabs>
+              <w:tab w:val="right" w:leader="dot" w:pos="9360"/>
+            </w:tabs>
+          </w:pPr>
+          <w:r>
+            <w:fldChar w:fldCharType="begin"/>
+          </w:r>
+          <w:r>
+            <w:instrText xml:space="preserve"> HYPERLINK \l _Toc27492 </w:instrText>
+          </w:r>
+          <w:r>
+            <w:fldChar w:fldCharType="separate"/>
+          </w:r>
+          <w:r>
+            <w:rPr>
+              <w:rFonts w:ascii="黑体" w:hAnsi="黑体" w:eastAsia="黑体" w:cs="黑体"/>
+            </w:rPr>
+            <w:t>10.4 实机分级放行</w:t>
+          </w:r>
+          <w:r>
+            <w:tab/>
+          </w:r>
+          <w:r>
+            <w:fldChar w:fldCharType="begin"/>
+          </w:r>
+          <w:r>
+            <w:instrText xml:space="preserve"> PAGEREF _Toc27492 \h </w:instrText>
+          </w:r>
+          <w:r>
+            <w:fldChar w:fldCharType="separate"/>
+          </w:r>
+          <w:r>
+            <w:t>25</w:t>
           </w:r>
           <w:r>
             <w:fldChar w:fldCharType="end"/>
@@ -2066,7 +2867,7 @@
             <w:fldChar w:fldCharType="begin"/>
           </w:r>
           <w:r>
-            <w:instrText xml:space="preserve"> HYPERLINK \l _Toc11043 </w:instrText>
+            <w:instrText xml:space="preserve"> HYPERLINK \l _Toc1293 </w:instrText>
           </w:r>
           <w:r>
             <w:fldChar w:fldCharType="separate"/>
@@ -2075,7 +2876,7 @@
             <w:rPr>
               <w:rFonts w:ascii="黑体" w:hAnsi="黑体" w:eastAsia="黑体" w:cs="黑体"/>
             </w:rPr>
-            <w:t>7  控制流程设计</w:t>
+            <w:t>11  烧写、启动与恢复</w:t>
           </w:r>
           <w:r>
             <w:tab/>
@@ -2084,13 +2885,13 @@
             <w:fldChar w:fldCharType="begin"/>
           </w:r>
           <w:r>
-            <w:instrText xml:space="preserve"> PAGEREF _Toc11043 \h </w:instrText>
+            <w:instrText xml:space="preserve"> PAGEREF _Toc1293 \h </w:instrText>
           </w:r>
           <w:r>
             <w:fldChar w:fldCharType="separate"/>
           </w:r>
           <w:r>
-            <w:t>19</w:t>
+            <w:t>25</w:t>
           </w:r>
           <w:r>
             <w:fldChar w:fldCharType="end"/>
@@ -2110,7 +2911,7 @@
             <w:fldChar w:fldCharType="begin"/>
           </w:r>
           <w:r>
-            <w:instrText xml:space="preserve"> HYPERLINK \l _Toc26727 </w:instrText>
+            <w:instrText xml:space="preserve"> HYPERLINK \l _Toc31393 </w:instrText>
           </w:r>
           <w:r>
             <w:fldChar w:fldCharType="separate"/>
@@ -2119,7 +2920,7 @@
             <w:rPr>
               <w:rFonts w:ascii="黑体" w:hAnsi="黑体" w:eastAsia="黑体" w:cs="黑体"/>
             </w:rPr>
-            <w:t>7.1 运行状态转换</w:t>
+            <w:t>11.1 SWD 主通道</w:t>
           </w:r>
           <w:r>
             <w:tab/>
@@ -2128,13 +2929,13 @@
             <w:fldChar w:fldCharType="begin"/>
           </w:r>
           <w:r>
-            <w:instrText xml:space="preserve"> PAGEREF _Toc26727 \h </w:instrText>
+            <w:instrText xml:space="preserve"> PAGEREF _Toc31393 \h </w:instrText>
           </w:r>
           <w:r>
             <w:fldChar w:fldCharType="separate"/>
           </w:r>
           <w:r>
-            <w:t>19</w:t>
+            <w:t>25</w:t>
           </w:r>
           <w:r>
             <w:fldChar w:fldCharType="end"/>
@@ -2154,7 +2955,7 @@
             <w:fldChar w:fldCharType="begin"/>
           </w:r>
           <w:r>
-            <w:instrText xml:space="preserve"> HYPERLINK \l _Toc7246 </w:instrText>
+            <w:instrText xml:space="preserve"> HYPERLINK \l _Toc31400 </w:instrText>
           </w:r>
           <w:r>
             <w:fldChar w:fldCharType="separate"/>
@@ -2163,7 +2964,7 @@
             <w:rPr>
               <w:rFonts w:ascii="黑体" w:hAnsi="黑体" w:eastAsia="黑体" w:cs="黑体"/>
             </w:rPr>
-            <w:t>7.2 控制来源</w:t>
+            <w:t>11.2 ISP 恢复通道</w:t>
           </w:r>
           <w:r>
             <w:tab/>
@@ -2172,13 +2973,13 @@
             <w:fldChar w:fldCharType="begin"/>
           </w:r>
           <w:r>
-            <w:instrText xml:space="preserve"> PAGEREF _Toc7246 \h </w:instrText>
+            <w:instrText xml:space="preserve"> PAGEREF _Toc31400 \h </w:instrText>
           </w:r>
           <w:r>
             <w:fldChar w:fldCharType="separate"/>
           </w:r>
           <w:r>
-            <w:t>20</w:t>
+            <w:t>25</w:t>
           </w:r>
           <w:r>
             <w:fldChar w:fldCharType="end"/>
@@ -2198,7 +2999,7 @@
             <w:fldChar w:fldCharType="begin"/>
           </w:r>
           <w:r>
-            <w:instrText xml:space="preserve"> HYPERLINK \l _Toc6126 </w:instrText>
+            <w:instrText xml:space="preserve"> HYPERLINK \l _Toc7933 </w:instrText>
           </w:r>
           <w:r>
             <w:fldChar w:fldCharType="separate"/>
@@ -2207,7 +3008,7 @@
             <w:rPr>
               <w:rFonts w:ascii="黑体" w:hAnsi="黑体" w:eastAsia="黑体" w:cs="黑体"/>
             </w:rPr>
-            <w:t>7.3 软起动与软停止</w:t>
+            <w:t>11.3 烧写检查清单</w:t>
           </w:r>
           <w:r>
             <w:tab/>
@@ -2216,13 +3017,13 @@
             <w:fldChar w:fldCharType="begin"/>
           </w:r>
           <w:r>
-            <w:instrText xml:space="preserve"> PAGEREF _Toc6126 \h </w:instrText>
+            <w:instrText xml:space="preserve"> PAGEREF _Toc7933 \h </w:instrText>
           </w:r>
           <w:r>
             <w:fldChar w:fldCharType="separate"/>
           </w:r>
           <w:r>
-            <w:t>20</w:t>
+            <w:t>26</w:t>
           </w:r>
           <w:r>
             <w:fldChar w:fldCharType="end"/>
@@ -2242,7 +3043,7 @@
             <w:fldChar w:fldCharType="begin"/>
           </w:r>
           <w:r>
-            <w:instrText xml:space="preserve"> HYPERLINK \l _Toc4035 </w:instrText>
+            <w:instrText xml:space="preserve"> HYPERLINK \l _Toc12465 </w:instrText>
           </w:r>
           <w:r>
             <w:fldChar w:fldCharType="separate"/>
@@ -2251,7 +3052,7 @@
             <w:rPr>
               <w:rFonts w:ascii="黑体" w:hAnsi="黑体" w:eastAsia="黑体" w:cs="黑体"/>
             </w:rPr>
-            <w:t>7.4 故障与保护</w:t>
+            <w:t>11.4 回退策略</w:t>
           </w:r>
           <w:r>
             <w:tab/>
@@ -2260,13 +3061,13 @@
             <w:fldChar w:fldCharType="begin"/>
           </w:r>
           <w:r>
-            <w:instrText xml:space="preserve"> PAGEREF _Toc4035 \h </w:instrText>
+            <w:instrText xml:space="preserve"> PAGEREF _Toc12465 \h </w:instrText>
           </w:r>
           <w:r>
             <w:fldChar w:fldCharType="separate"/>
           </w:r>
           <w:r>
-            <w:t>20</w:t>
+            <w:t>26</w:t>
           </w:r>
           <w:r>
             <w:fldChar w:fldCharType="end"/>
@@ -2286,7 +3087,7 @@
             <w:fldChar w:fldCharType="begin"/>
           </w:r>
           <w:r>
-            <w:instrText xml:space="preserve"> HYPERLINK \l _Toc5659 </w:instrText>
+            <w:instrText xml:space="preserve"> HYPERLINK \l _Toc31665 </w:instrText>
           </w:r>
           <w:r>
             <w:fldChar w:fldCharType="separate"/>
@@ -2295,7 +3096,7 @@
             <w:rPr>
               <w:rFonts w:ascii="黑体" w:hAnsi="黑体" w:eastAsia="黑体" w:cs="黑体"/>
             </w:rPr>
-            <w:t>8  工程结构与编码规范</w:t>
+            <w:t>12  调试与故障定位</w:t>
           </w:r>
           <w:r>
             <w:tab/>
@@ -2304,13 +3105,13 @@
             <w:fldChar w:fldCharType="begin"/>
           </w:r>
           <w:r>
-            <w:instrText xml:space="preserve"> PAGEREF _Toc5659 \h </w:instrText>
+            <w:instrText xml:space="preserve"> PAGEREF _Toc31665 \h </w:instrText>
           </w:r>
           <w:r>
             <w:fldChar w:fldCharType="separate"/>
           </w:r>
           <w:r>
-            <w:t>21</w:t>
+            <w:t>26</w:t>
           </w:r>
           <w:r>
             <w:fldChar w:fldCharType="end"/>
@@ -2330,7 +3131,7 @@
             <w:fldChar w:fldCharType="begin"/>
           </w:r>
           <w:r>
-            <w:instrText xml:space="preserve"> HYPERLINK \l _Toc28602 </w:instrText>
+            <w:instrText xml:space="preserve"> HYPERLINK \l _Toc26058 </w:instrText>
           </w:r>
           <w:r>
             <w:fldChar w:fldCharType="separate"/>
@@ -2339,7 +3140,7 @@
             <w:rPr>
               <w:rFonts w:ascii="黑体" w:hAnsi="黑体" w:eastAsia="黑体" w:cs="黑体"/>
             </w:rPr>
-            <w:t>8.1 工程目录</w:t>
+            <w:t>12.1 调试方法</w:t>
           </w:r>
           <w:r>
             <w:tab/>
@@ -2348,13 +3149,13 @@
             <w:fldChar w:fldCharType="begin"/>
           </w:r>
           <w:r>
-            <w:instrText xml:space="preserve"> PAGEREF _Toc28602 \h </w:instrText>
+            <w:instrText xml:space="preserve"> PAGEREF _Toc26058 \h </w:instrText>
           </w:r>
           <w:r>
             <w:fldChar w:fldCharType="separate"/>
           </w:r>
           <w:r>
-            <w:t>21</w:t>
+            <w:t>26</w:t>
           </w:r>
           <w:r>
             <w:fldChar w:fldCharType="end"/>
@@ -2374,7 +3175,7 @@
             <w:fldChar w:fldCharType="begin"/>
           </w:r>
           <w:r>
-            <w:instrText xml:space="preserve"> HYPERLINK \l _Toc14931 </w:instrText>
+            <w:instrText xml:space="preserve"> HYPERLINK \l _Toc9180 </w:instrText>
           </w:r>
           <w:r>
             <w:fldChar w:fldCharType="separate"/>
@@ -2383,7 +3184,7 @@
             <w:rPr>
               <w:rFonts w:ascii="黑体" w:hAnsi="黑体" w:eastAsia="黑体" w:cs="黑体"/>
             </w:rPr>
-            <w:t>8.2 编码规范</w:t>
+            <w:t>12.2 日志与记录</w:t>
           </w:r>
           <w:r>
             <w:tab/>
@@ -2392,13 +3193,13 @@
             <w:fldChar w:fldCharType="begin"/>
           </w:r>
           <w:r>
-            <w:instrText xml:space="preserve"> PAGEREF _Toc14931 \h </w:instrText>
+            <w:instrText xml:space="preserve"> PAGEREF _Toc9180 \h </w:instrText>
           </w:r>
           <w:r>
             <w:fldChar w:fldCharType="separate"/>
           </w:r>
           <w:r>
-            <w:t>21</w:t>
+            <w:t>27</w:t>
           </w:r>
           <w:r>
             <w:fldChar w:fldCharType="end"/>
@@ -2418,7 +3219,7 @@
             <w:fldChar w:fldCharType="begin"/>
           </w:r>
           <w:r>
-            <w:instrText xml:space="preserve"> HYPERLINK \l _Toc15319 </w:instrText>
+            <w:instrText xml:space="preserve"> HYPERLINK \l _Toc7040 </w:instrText>
           </w:r>
           <w:r>
             <w:fldChar w:fldCharType="separate"/>
@@ -2427,7 +3228,7 @@
             <w:rPr>
               <w:rFonts w:ascii="黑体" w:hAnsi="黑体" w:eastAsia="黑体" w:cs="黑体"/>
             </w:rPr>
-            <w:t>8.3 变更影响分析</w:t>
+            <w:t>12.3 高风险开发陷阱</w:t>
           </w:r>
           <w:r>
             <w:tab/>
@@ -2436,13 +3237,13 @@
             <w:fldChar w:fldCharType="begin"/>
           </w:r>
           <w:r>
-            <w:instrText xml:space="preserve"> PAGEREF _Toc15319 \h </w:instrText>
+            <w:instrText xml:space="preserve"> PAGEREF _Toc7040 \h </w:instrText>
           </w:r>
           <w:r>
             <w:fldChar w:fldCharType="separate"/>
           </w:r>
           <w:r>
-            <w:t>21</w:t>
+            <w:t>27</w:t>
           </w:r>
           <w:r>
             <w:fldChar w:fldCharType="end"/>
@@ -2462,7 +3263,7 @@
             <w:fldChar w:fldCharType="begin"/>
           </w:r>
           <w:r>
-            <w:instrText xml:space="preserve"> HYPERLINK \l _Toc7251 </w:instrText>
+            <w:instrText xml:space="preserve"> HYPERLINK \l _Toc27193 </w:instrText>
           </w:r>
           <w:r>
             <w:fldChar w:fldCharType="separate"/>
@@ -2471,7 +3272,7 @@
             <w:rPr>
               <w:rFonts w:ascii="黑体" w:hAnsi="黑体" w:eastAsia="黑体" w:cs="黑体"/>
             </w:rPr>
-            <w:t>9  构建与开发环境</w:t>
+            <w:t>13  发布与维护</w:t>
           </w:r>
           <w:r>
             <w:tab/>
@@ -2480,13 +3281,13 @@
             <w:fldChar w:fldCharType="begin"/>
           </w:r>
           <w:r>
-            <w:instrText xml:space="preserve"> PAGEREF _Toc7251 \h </w:instrText>
+            <w:instrText xml:space="preserve"> PAGEREF _Toc27193 \h </w:instrText>
           </w:r>
           <w:r>
             <w:fldChar w:fldCharType="separate"/>
           </w:r>
           <w:r>
-            <w:t>22</w:t>
+            <w:t>28</w:t>
           </w:r>
           <w:r>
             <w:fldChar w:fldCharType="end"/>
@@ -2506,7 +3307,7 @@
             <w:fldChar w:fldCharType="begin"/>
           </w:r>
           <w:r>
-            <w:instrText xml:space="preserve"> HYPERLINK \l _Toc28919 </w:instrText>
+            <w:instrText xml:space="preserve"> HYPERLINK \l _Toc15248 </w:instrText>
           </w:r>
           <w:r>
             <w:fldChar w:fldCharType="separate"/>
@@ -2515,7 +3316,7 @@
             <w:rPr>
               <w:rFonts w:ascii="黑体" w:hAnsi="黑体" w:eastAsia="黑体" w:cs="黑体"/>
             </w:rPr>
-            <w:t>9.1 工具依赖</w:t>
+            <w:t>13.1 发布流程</w:t>
           </w:r>
           <w:r>
             <w:tab/>
@@ -2524,13 +3325,13 @@
             <w:fldChar w:fldCharType="begin"/>
           </w:r>
           <w:r>
-            <w:instrText xml:space="preserve"> PAGEREF _Toc28919 \h </w:instrText>
+            <w:instrText xml:space="preserve"> PAGEREF _Toc15248 \h </w:instrText>
           </w:r>
           <w:r>
             <w:fldChar w:fldCharType="separate"/>
           </w:r>
           <w:r>
-            <w:t>22</w:t>
+            <w:t>28</w:t>
           </w:r>
           <w:r>
             <w:fldChar w:fldCharType="end"/>
@@ -2550,7 +3351,7 @@
             <w:fldChar w:fldCharType="begin"/>
           </w:r>
           <w:r>
-            <w:instrText xml:space="preserve"> HYPERLINK \l _Toc24880 </w:instrText>
+            <w:instrText xml:space="preserve"> HYPERLINK \l _Toc13238 </w:instrText>
           </w:r>
           <w:r>
             <w:fldChar w:fldCharType="separate"/>
@@ -2559,7 +3360,7 @@
             <w:rPr>
               <w:rFonts w:ascii="黑体" w:hAnsi="黑体" w:eastAsia="黑体" w:cs="黑体"/>
             </w:rPr>
-            <w:t>9.2 编译参数</w:t>
+            <w:t>13.2 发布检查表</w:t>
           </w:r>
           <w:r>
             <w:tab/>
@@ -2568,13 +3369,13 @@
             <w:fldChar w:fldCharType="begin"/>
           </w:r>
           <w:r>
-            <w:instrText xml:space="preserve"> PAGEREF _Toc24880 \h </w:instrText>
+            <w:instrText xml:space="preserve"> PAGEREF _Toc13238 \h </w:instrText>
           </w:r>
           <w:r>
             <w:fldChar w:fldCharType="separate"/>
           </w:r>
           <w:r>
-            <w:t>22</w:t>
+            <w:t>28</w:t>
           </w:r>
           <w:r>
             <w:fldChar w:fldCharType="end"/>
@@ -2594,7 +3395,7 @@
             <w:fldChar w:fldCharType="begin"/>
           </w:r>
           <w:r>
-            <w:instrText xml:space="preserve"> HYPERLINK \l _Toc5320 </w:instrText>
+            <w:instrText xml:space="preserve"> HYPERLINK \l _Toc22705 </w:instrText>
           </w:r>
           <w:r>
             <w:fldChar w:fldCharType="separate"/>
@@ -2603,7 +3404,7 @@
             <w:rPr>
               <w:rFonts w:ascii="黑体" w:hAnsi="黑体" w:eastAsia="黑体" w:cs="黑体"/>
             </w:rPr>
-            <w:t>9.3 标准构建</w:t>
+            <w:t>13.3 扩展开发建议</w:t>
           </w:r>
           <w:r>
             <w:tab/>
@@ -2612,13 +3413,57 @@
             <w:fldChar w:fldCharType="begin"/>
           </w:r>
           <w:r>
-            <w:instrText xml:space="preserve"> PAGEREF _Toc5320 \h </w:instrText>
+            <w:instrText xml:space="preserve"> PAGEREF _Toc22705 \h </w:instrText>
           </w:r>
           <w:r>
             <w:fldChar w:fldCharType="separate"/>
           </w:r>
           <w:r>
-            <w:t>23</w:t>
+            <w:t>28</w:t>
+          </w:r>
+          <w:r>
+            <w:fldChar w:fldCharType="end"/>
+          </w:r>
+          <w:r>
+            <w:fldChar w:fldCharType="end"/>
+          </w:r>
+        </w:p>
+        <w:p>
+          <w:pPr>
+            <w:pStyle w:val="26"/>
+            <w:tabs>
+              <w:tab w:val="right" w:leader="dot" w:pos="9360"/>
+            </w:tabs>
+          </w:pPr>
+          <w:r>
+            <w:fldChar w:fldCharType="begin"/>
+          </w:r>
+          <w:r>
+            <w:instrText xml:space="preserve"> HYPERLINK \l _Toc2986 </w:instrText>
+          </w:r>
+          <w:r>
+            <w:fldChar w:fldCharType="separate"/>
+          </w:r>
+          <w:r>
+            <w:rPr>
+              <w:rFonts w:ascii="黑体" w:hAnsi="黑体" w:eastAsia="黑体" w:cs="黑体"/>
+            </w:rPr>
+            <w:t>14  附录</w:t>
+          </w:r>
+          <w:r>
+            <w:tab/>
+          </w:r>
+          <w:r>
+            <w:fldChar w:fldCharType="begin"/>
+          </w:r>
+          <w:r>
+            <w:instrText xml:space="preserve"> PAGEREF _Toc2986 \h </w:instrText>
+          </w:r>
+          <w:r>
+            <w:fldChar w:fldCharType="separate"/>
+          </w:r>
+          <w:r>
+            <w:t>29</w:t>
           </w:r>
           <w:r>
             <w:fldChar w:fldCharType="end"/>
@@ -2638,7 +3483,7 @@
             <w:fldChar w:fldCharType="begin"/>
           </w:r>
           <w:r>
-            <w:instrText xml:space="preserve"> HYPERLINK \l _Toc16676 </w:instrText>
+            <w:instrText xml:space="preserve"> HYPERLINK \l _Toc28274 </w:instrText>
           </w:r>
           <w:r>
             <w:fldChar w:fldCharType="separate"/>
@@ -2647,7 +3492,7 @@
             <w:rPr>
               <w:rFonts w:ascii="黑体" w:hAnsi="黑体" w:eastAsia="黑体" w:cs="黑体"/>
             </w:rPr>
-            <w:t>9.4 构建后检查</w:t>
+            <w:t>14.1 常用命令</w:t>
           </w:r>
           <w:r>
             <w:tab/>
@@ -2656,57 +3501,13 @@
             <w:fldChar w:fldCharType="begin"/>
           </w:r>
           <w:r>
-            <w:instrText xml:space="preserve"> PAGEREF _Toc16676 \h </w:instrText>
+            <w:instrText xml:space="preserve"> PAGEREF _Toc28274 \h </w:instrText>
           </w:r>
           <w:r>
             <w:fldChar w:fldCharType="separate"/>
           </w:r>
           <w:r>
-            <w:t>23</w:t>
-          </w:r>
-          <w:r>
-            <w:fldChar w:fldCharType="end"/>
-          </w:r>
-          <w:r>
-            <w:fldChar w:fldCharType="end"/>
-          </w:r>
-        </w:p>
-        <w:p>
-          <w:pPr>
-            <w:pStyle w:val="26"/>
-            <w:tabs>
-              <w:tab w:val="right" w:leader="dot" w:pos="9360"/>
-            </w:tabs>
-          </w:pPr>
-          <w:r>
-            <w:fldChar w:fldCharType="begin"/>
-          </w:r>
-          <w:r>
-            <w:instrText xml:space="preserve"> HYPERLINK \l _Toc10968 </w:instrText>
-          </w:r>
-          <w:r>
-            <w:fldChar w:fldCharType="separate"/>
-          </w:r>
-          <w:r>
-            <w:rPr>
-              <w:rFonts w:ascii="黑体" w:hAnsi="黑体" w:eastAsia="黑体" w:cs="黑体"/>
-            </w:rPr>
-            <w:t>10  测试与质量保证</w:t>
-          </w:r>
-          <w:r>
-            <w:tab/>
-          </w:r>
-          <w:r>
-            <w:fldChar w:fldCharType="begin"/>
-          </w:r>
-          <w:r>
-            <w:instrText xml:space="preserve"> PAGEREF _Toc10968 \h </w:instrText>
-          </w:r>
-          <w:r>
-            <w:fldChar w:fldCharType="separate"/>
-          </w:r>
-          <w:r>
-            <w:t>23</w:t>
+            <w:t>29</w:t>
           </w:r>
           <w:r>
             <w:fldChar w:fldCharType="end"/>
@@ -2726,7 +3527,7 @@
             <w:fldChar w:fldCharType="begin"/>
           </w:r>
           <w:r>
-            <w:instrText xml:space="preserve"> HYPERLINK \l _Toc5337 </w:instrText>
+            <w:instrText xml:space="preserve"> HYPERLINK \l _Toc28337 </w:instrText>
           </w:r>
           <w:r>
             <w:fldChar w:fldCharType="separate"/>
@@ -2735,7 +3536,7 @@
             <w:rPr>
               <w:rFonts w:ascii="黑体" w:hAnsi="黑体" w:eastAsia="黑体" w:cs="黑体"/>
             </w:rPr>
-            <w:t>10.1 测试分层</w:t>
+            <w:t>14.2 关键常量</w:t>
           </w:r>
           <w:r>
             <w:tab/>
@@ -2744,13 +3545,13 @@
             <w:fldChar w:fldCharType="begin"/>
           </w:r>
           <w:r>
-            <w:instrText xml:space="preserve"> PAGEREF _Toc5337 \h </w:instrText>
+            <w:instrText xml:space="preserve"> PAGEREF _Toc28337 \h </w:instrText>
           </w:r>
           <w:r>
             <w:fldChar w:fldCharType="separate"/>
           </w:r>
           <w:r>
-            <w:t>23</w:t>
+            <w:t>29</w:t>
           </w:r>
           <w:r>
             <w:fldChar w:fldCharType="end"/>
@@ -2770,843 +3571,7 @@
             <w:fldChar w:fldCharType="begin"/>
           </w:r>
           <w:r>
-            <w:instrText xml:space="preserve"> HYPERLINK \l _Toc18219 </w:instrText>
-          </w:r>
-          <w:r>
-            <w:fldChar w:fldCharType="separate"/>
-          </w:r>
-          <w:r>
-            <w:rPr>
-              <w:rFonts w:ascii="黑体" w:hAnsi="黑体" w:eastAsia="黑体" w:cs="黑体"/>
-            </w:rPr>
-            <w:t>10.2 自动化测试入口</w:t>
-          </w:r>
-          <w:r>
-            <w:tab/>
-          </w:r>
-          <w:r>
-            <w:fldChar w:fldCharType="begin"/>
-          </w:r>
-          <w:r>
-            <w:instrText xml:space="preserve"> PAGEREF _Toc18219 \h </w:instrText>
-          </w:r>
-          <w:r>
-            <w:fldChar w:fldCharType="separate"/>
-          </w:r>
-          <w:r>
-            <w:t>24</w:t>
-          </w:r>
-          <w:r>
-            <w:fldChar w:fldCharType="end"/>
-          </w:r>
-          <w:r>
-            <w:fldChar w:fldCharType="end"/>
-          </w:r>
-        </w:p>
-        <w:p>
-          <w:pPr>
-            <w:pStyle w:val="29"/>
-            <w:tabs>
-              <w:tab w:val="right" w:leader="dot" w:pos="9360"/>
-            </w:tabs>
-          </w:pPr>
-          <w:r>
-            <w:fldChar w:fldCharType="begin"/>
-          </w:r>
-          <w:r>
-            <w:instrText xml:space="preserve"> HYPERLINK \l _Toc28193 </w:instrText>
-          </w:r>
-          <w:r>
-            <w:fldChar w:fldCharType="separate"/>
-          </w:r>
-          <w:r>
-            <w:rPr>
-              <w:rFonts w:ascii="黑体" w:hAnsi="黑体" w:eastAsia="黑体" w:cs="黑体"/>
-            </w:rPr>
-            <w:t>10.3 重点测试矩阵</w:t>
-          </w:r>
-          <w:r>
-            <w:tab/>
-          </w:r>
-          <w:r>
-            <w:fldChar w:fldCharType="begin"/>
-          </w:r>
-          <w:r>
-            <w:instrText xml:space="preserve"> PAGEREF _Toc28193 \h </w:instrText>
-          </w:r>
-          <w:r>
-            <w:fldChar w:fldCharType="separate"/>
-          </w:r>
-          <w:r>
-            <w:t>24</w:t>
-          </w:r>
-          <w:r>
-            <w:fldChar w:fldCharType="end"/>
-          </w:r>
-          <w:r>
-            <w:fldChar w:fldCharType="end"/>
-          </w:r>
-        </w:p>
-        <w:p>
-          <w:pPr>
-            <w:pStyle w:val="29"/>
-            <w:tabs>
-              <w:tab w:val="right" w:leader="dot" w:pos="9360"/>
-            </w:tabs>
-          </w:pPr>
-          <w:r>
-            <w:fldChar w:fldCharType="begin"/>
-          </w:r>
-          <w:r>
-            <w:instrText xml:space="preserve"> HYPERLINK \l _Toc21165 </w:instrText>
-          </w:r>
-          <w:r>
-            <w:fldChar w:fldCharType="separate"/>
-          </w:r>
-          <w:r>
-            <w:rPr>
-              <w:rFonts w:ascii="黑体" w:hAnsi="黑体" w:eastAsia="黑体" w:cs="黑体"/>
-            </w:rPr>
-            <w:t>10.4 实机分级放行</w:t>
-          </w:r>
-          <w:r>
-            <w:tab/>
-          </w:r>
-          <w:r>
-            <w:fldChar w:fldCharType="begin"/>
-          </w:r>
-          <w:r>
-            <w:instrText xml:space="preserve"> PAGEREF _Toc21165 \h </w:instrText>
-          </w:r>
-          <w:r>
-            <w:fldChar w:fldCharType="separate"/>
-          </w:r>
-          <w:r>
-            <w:t>25</w:t>
-          </w:r>
-          <w:r>
-            <w:fldChar w:fldCharType="end"/>
-          </w:r>
-          <w:r>
-            <w:fldChar w:fldCharType="end"/>
-          </w:r>
-        </w:p>
-        <w:p>
-          <w:pPr>
-            <w:pStyle w:val="26"/>
-            <w:tabs>
-              <w:tab w:val="right" w:leader="dot" w:pos="9360"/>
-            </w:tabs>
-          </w:pPr>
-          <w:r>
-            <w:fldChar w:fldCharType="begin"/>
-          </w:r>
-          <w:r>
-            <w:instrText xml:space="preserve"> HYPERLINK \l _Toc7982 </w:instrText>
-          </w:r>
-          <w:r>
-            <w:fldChar w:fldCharType="separate"/>
-          </w:r>
-          <w:r>
-            <w:rPr>
-              <w:rFonts w:ascii="黑体" w:hAnsi="黑体" w:eastAsia="黑体" w:cs="黑体"/>
-            </w:rPr>
-            <w:t>11  烧写、启动与恢复</w:t>
-          </w:r>
-          <w:r>
-            <w:tab/>
-          </w:r>
-          <w:r>
-            <w:fldChar w:fldCharType="begin"/>
-          </w:r>
-          <w:r>
-            <w:instrText xml:space="preserve"> PAGEREF _Toc7982 \h </w:instrText>
-          </w:r>
-          <w:r>
-            <w:fldChar w:fldCharType="separate"/>
-          </w:r>
-          <w:r>
-            <w:t>25</w:t>
-          </w:r>
-          <w:r>
-            <w:fldChar w:fldCharType="end"/>
-          </w:r>
-          <w:r>
-            <w:fldChar w:fldCharType="end"/>
-          </w:r>
-        </w:p>
-        <w:p>
-          <w:pPr>
-            <w:pStyle w:val="29"/>
-            <w:tabs>
-              <w:tab w:val="right" w:leader="dot" w:pos="9360"/>
-            </w:tabs>
-          </w:pPr>
-          <w:r>
-            <w:fldChar w:fldCharType="begin"/>
-          </w:r>
-          <w:r>
-            <w:instrText xml:space="preserve"> HYPERLINK \l _Toc30705 </w:instrText>
-          </w:r>
-          <w:r>
-            <w:fldChar w:fldCharType="separate"/>
-          </w:r>
-          <w:r>
-            <w:rPr>
-              <w:rFonts w:ascii="黑体" w:hAnsi="黑体" w:eastAsia="黑体" w:cs="黑体"/>
-            </w:rPr>
-            <w:t>11.1 SWD 主通道</w:t>
-          </w:r>
-          <w:r>
-            <w:tab/>
-          </w:r>
-          <w:r>
-            <w:fldChar w:fldCharType="begin"/>
-          </w:r>
-          <w:r>
-            <w:instrText xml:space="preserve"> PAGEREF _Toc30705 \h </w:instrText>
-          </w:r>
-          <w:r>
-            <w:fldChar w:fldCharType="separate"/>
-          </w:r>
-          <w:r>
-            <w:t>25</w:t>
-          </w:r>
-          <w:r>
-            <w:fldChar w:fldCharType="end"/>
-          </w:r>
-          <w:r>
-            <w:fldChar w:fldCharType="end"/>
-          </w:r>
-        </w:p>
-        <w:p>
-          <w:pPr>
-            <w:pStyle w:val="29"/>
-            <w:tabs>
-              <w:tab w:val="right" w:leader="dot" w:pos="9360"/>
-            </w:tabs>
-          </w:pPr>
-          <w:r>
-            <w:fldChar w:fldCharType="begin"/>
-          </w:r>
-          <w:r>
-            <w:instrText xml:space="preserve"> HYPERLINK \l _Toc27847 </w:instrText>
-          </w:r>
-          <w:r>
-            <w:fldChar w:fldCharType="separate"/>
-          </w:r>
-          <w:r>
-            <w:rPr>
-              <w:rFonts w:ascii="黑体" w:hAnsi="黑体" w:eastAsia="黑体" w:cs="黑体"/>
-            </w:rPr>
-            <w:t>11.2 ISP 恢复通道</w:t>
-          </w:r>
-          <w:r>
-            <w:tab/>
-          </w:r>
-          <w:r>
-            <w:fldChar w:fldCharType="begin"/>
-          </w:r>
-          <w:r>
-            <w:instrText xml:space="preserve"> PAGEREF _Toc27847 \h </w:instrText>
-          </w:r>
-          <w:r>
-            <w:fldChar w:fldCharType="separate"/>
-          </w:r>
-          <w:r>
-            <w:t>25</w:t>
-          </w:r>
-          <w:r>
-            <w:fldChar w:fldCharType="end"/>
-          </w:r>
-          <w:r>
-            <w:fldChar w:fldCharType="end"/>
-          </w:r>
-        </w:p>
-        <w:p>
-          <w:pPr>
-            <w:pStyle w:val="29"/>
-            <w:tabs>
-              <w:tab w:val="right" w:leader="dot" w:pos="9360"/>
-            </w:tabs>
-          </w:pPr>
-          <w:r>
-            <w:fldChar w:fldCharType="begin"/>
-          </w:r>
-          <w:r>
-            <w:instrText xml:space="preserve"> HYPERLINK \l _Toc8983 </w:instrText>
-          </w:r>
-          <w:r>
-            <w:fldChar w:fldCharType="separate"/>
-          </w:r>
-          <w:r>
-            <w:rPr>
-              <w:rFonts w:ascii="黑体" w:hAnsi="黑体" w:eastAsia="黑体" w:cs="黑体"/>
-            </w:rPr>
-            <w:t>11.3 烧写检查清单</w:t>
-          </w:r>
-          <w:r>
-            <w:tab/>
-          </w:r>
-          <w:r>
-            <w:fldChar w:fldCharType="begin"/>
-          </w:r>
-          <w:r>
-            <w:instrText xml:space="preserve"> PAGEREF _Toc8983 \h </w:instrText>
-          </w:r>
-          <w:r>
-            <w:fldChar w:fldCharType="separate"/>
-          </w:r>
-          <w:r>
-            <w:t>26</w:t>
-          </w:r>
-          <w:r>
-            <w:fldChar w:fldCharType="end"/>
-          </w:r>
-          <w:r>
-            <w:fldChar w:fldCharType="end"/>
-          </w:r>
-        </w:p>
-        <w:p>
-          <w:pPr>
-            <w:pStyle w:val="29"/>
-            <w:tabs>
-              <w:tab w:val="right" w:leader="dot" w:pos="9360"/>
-            </w:tabs>
-          </w:pPr>
-          <w:r>
-            <w:fldChar w:fldCharType="begin"/>
-          </w:r>
-          <w:r>
-            <w:instrText xml:space="preserve"> HYPERLINK \l _Toc19228 </w:instrText>
-          </w:r>
-          <w:r>
-            <w:fldChar w:fldCharType="separate"/>
-          </w:r>
-          <w:r>
-            <w:rPr>
-              <w:rFonts w:ascii="黑体" w:hAnsi="黑体" w:eastAsia="黑体" w:cs="黑体"/>
-            </w:rPr>
-            <w:t>11.4 回退策略</w:t>
-          </w:r>
-          <w:r>
-            <w:tab/>
-          </w:r>
-          <w:r>
-            <w:fldChar w:fldCharType="begin"/>
-          </w:r>
-          <w:r>
-            <w:instrText xml:space="preserve"> PAGEREF _Toc19228 \h </w:instrText>
-          </w:r>
-          <w:r>
-            <w:fldChar w:fldCharType="separate"/>
-          </w:r>
-          <w:r>
-            <w:t>26</w:t>
-          </w:r>
-          <w:r>
-            <w:fldChar w:fldCharType="end"/>
-          </w:r>
-          <w:r>
-            <w:fldChar w:fldCharType="end"/>
-          </w:r>
-        </w:p>
-        <w:p>
-          <w:pPr>
-            <w:pStyle w:val="26"/>
-            <w:tabs>
-              <w:tab w:val="right" w:leader="dot" w:pos="9360"/>
-            </w:tabs>
-          </w:pPr>
-          <w:r>
-            <w:fldChar w:fldCharType="begin"/>
-          </w:r>
-          <w:r>
-            <w:instrText xml:space="preserve"> HYPERLINK \l _Toc5597 </w:instrText>
-          </w:r>
-          <w:r>
-            <w:fldChar w:fldCharType="separate"/>
-          </w:r>
-          <w:r>
-            <w:rPr>
-              <w:rFonts w:ascii="黑体" w:hAnsi="黑体" w:eastAsia="黑体" w:cs="黑体"/>
-            </w:rPr>
-            <w:t>12  调试与故障定位</w:t>
-          </w:r>
-          <w:r>
-            <w:tab/>
-          </w:r>
-          <w:r>
-            <w:fldChar w:fldCharType="begin"/>
-          </w:r>
-          <w:r>
-            <w:instrText xml:space="preserve"> PAGEREF _Toc5597 \h </w:instrText>
-          </w:r>
-          <w:r>
-            <w:fldChar w:fldCharType="separate"/>
-          </w:r>
-          <w:r>
-            <w:t>26</w:t>
-          </w:r>
-          <w:r>
-            <w:fldChar w:fldCharType="end"/>
-          </w:r>
-          <w:r>
-            <w:fldChar w:fldCharType="end"/>
-          </w:r>
-        </w:p>
-        <w:p>
-          <w:pPr>
-            <w:pStyle w:val="29"/>
-            <w:tabs>
-              <w:tab w:val="right" w:leader="dot" w:pos="9360"/>
-            </w:tabs>
-          </w:pPr>
-          <w:r>
-            <w:fldChar w:fldCharType="begin"/>
-          </w:r>
-          <w:r>
-            <w:instrText xml:space="preserve"> HYPERLINK \l _Toc16921 </w:instrText>
-          </w:r>
-          <w:r>
-            <w:fldChar w:fldCharType="separate"/>
-          </w:r>
-          <w:r>
-            <w:rPr>
-              <w:rFonts w:ascii="黑体" w:hAnsi="黑体" w:eastAsia="黑体" w:cs="黑体"/>
-            </w:rPr>
-            <w:t>12.1 调试方法</w:t>
-          </w:r>
-          <w:r>
-            <w:tab/>
-          </w:r>
-          <w:r>
-            <w:fldChar w:fldCharType="begin"/>
-          </w:r>
-          <w:r>
-            <w:instrText xml:space="preserve"> PAGEREF _Toc16921 \h </w:instrText>
-          </w:r>
-          <w:r>
-            <w:fldChar w:fldCharType="separate"/>
-          </w:r>
-          <w:r>
-            <w:t>26</w:t>
-          </w:r>
-          <w:r>
-            <w:fldChar w:fldCharType="end"/>
-          </w:r>
-          <w:r>
-            <w:fldChar w:fldCharType="end"/>
-          </w:r>
-        </w:p>
-        <w:p>
-          <w:pPr>
-            <w:pStyle w:val="29"/>
-            <w:tabs>
-              <w:tab w:val="right" w:leader="dot" w:pos="9360"/>
-            </w:tabs>
-          </w:pPr>
-          <w:r>
-            <w:fldChar w:fldCharType="begin"/>
-          </w:r>
-          <w:r>
-            <w:instrText xml:space="preserve"> HYPERLINK \l _Toc22811 </w:instrText>
-          </w:r>
-          <w:r>
-            <w:fldChar w:fldCharType="separate"/>
-          </w:r>
-          <w:r>
-            <w:rPr>
-              <w:rFonts w:ascii="黑体" w:hAnsi="黑体" w:eastAsia="黑体" w:cs="黑体"/>
-            </w:rPr>
-            <w:t>12.2 日志与记录</w:t>
-          </w:r>
-          <w:r>
-            <w:tab/>
-          </w:r>
-          <w:r>
-            <w:fldChar w:fldCharType="begin"/>
-          </w:r>
-          <w:r>
-            <w:instrText xml:space="preserve"> PAGEREF _Toc22811 \h </w:instrText>
-          </w:r>
-          <w:r>
-            <w:fldChar w:fldCharType="separate"/>
-          </w:r>
-          <w:r>
-            <w:t>27</w:t>
-          </w:r>
-          <w:r>
-            <w:fldChar w:fldCharType="end"/>
-          </w:r>
-          <w:r>
-            <w:fldChar w:fldCharType="end"/>
-          </w:r>
-        </w:p>
-        <w:p>
-          <w:pPr>
-            <w:pStyle w:val="29"/>
-            <w:tabs>
-              <w:tab w:val="right" w:leader="dot" w:pos="9360"/>
-            </w:tabs>
-          </w:pPr>
-          <w:r>
-            <w:fldChar w:fldCharType="begin"/>
-          </w:r>
-          <w:r>
-            <w:instrText xml:space="preserve"> HYPERLINK \l _Toc15719 </w:instrText>
-          </w:r>
-          <w:r>
-            <w:fldChar w:fldCharType="separate"/>
-          </w:r>
-          <w:r>
-            <w:rPr>
-              <w:rFonts w:ascii="黑体" w:hAnsi="黑体" w:eastAsia="黑体" w:cs="黑体"/>
-            </w:rPr>
-            <w:t>12.3 高风险开发陷阱</w:t>
-          </w:r>
-          <w:r>
-            <w:tab/>
-          </w:r>
-          <w:r>
-            <w:fldChar w:fldCharType="begin"/>
-          </w:r>
-          <w:r>
-            <w:instrText xml:space="preserve"> PAGEREF _Toc15719 \h </w:instrText>
-          </w:r>
-          <w:r>
-            <w:fldChar w:fldCharType="separate"/>
-          </w:r>
-          <w:r>
-            <w:t>27</w:t>
-          </w:r>
-          <w:r>
-            <w:fldChar w:fldCharType="end"/>
-          </w:r>
-          <w:r>
-            <w:fldChar w:fldCharType="end"/>
-          </w:r>
-        </w:p>
-        <w:p>
-          <w:pPr>
-            <w:pStyle w:val="26"/>
-            <w:tabs>
-              <w:tab w:val="right" w:leader="dot" w:pos="9360"/>
-            </w:tabs>
-          </w:pPr>
-          <w:r>
-            <w:fldChar w:fldCharType="begin"/>
-          </w:r>
-          <w:r>
-            <w:instrText xml:space="preserve"> HYPERLINK \l _Toc24380 </w:instrText>
-          </w:r>
-          <w:r>
-            <w:fldChar w:fldCharType="separate"/>
-          </w:r>
-          <w:r>
-            <w:rPr>
-              <w:rFonts w:ascii="黑体" w:hAnsi="黑体" w:eastAsia="黑体" w:cs="黑体"/>
-            </w:rPr>
-            <w:t>13  发布与维护</w:t>
-          </w:r>
-          <w:r>
-            <w:tab/>
-          </w:r>
-          <w:r>
-            <w:fldChar w:fldCharType="begin"/>
-          </w:r>
-          <w:r>
-            <w:instrText xml:space="preserve"> PAGEREF _Toc24380 \h </w:instrText>
-          </w:r>
-          <w:r>
-            <w:fldChar w:fldCharType="separate"/>
-          </w:r>
-          <w:r>
-            <w:t>28</w:t>
-          </w:r>
-          <w:r>
-            <w:fldChar w:fldCharType="end"/>
-          </w:r>
-          <w:r>
-            <w:fldChar w:fldCharType="end"/>
-          </w:r>
-        </w:p>
-        <w:p>
-          <w:pPr>
-            <w:pStyle w:val="29"/>
-            <w:tabs>
-              <w:tab w:val="right" w:leader="dot" w:pos="9360"/>
-            </w:tabs>
-          </w:pPr>
-          <w:r>
-            <w:fldChar w:fldCharType="begin"/>
-          </w:r>
-          <w:r>
-            <w:instrText xml:space="preserve"> HYPERLINK \l _Toc28039 </w:instrText>
-          </w:r>
-          <w:r>
-            <w:fldChar w:fldCharType="separate"/>
-          </w:r>
-          <w:r>
-            <w:rPr>
-              <w:rFonts w:ascii="黑体" w:hAnsi="黑体" w:eastAsia="黑体" w:cs="黑体"/>
-            </w:rPr>
-            <w:t>13.1 发布流程</w:t>
-          </w:r>
-          <w:r>
-            <w:tab/>
-          </w:r>
-          <w:r>
-            <w:fldChar w:fldCharType="begin"/>
-          </w:r>
-          <w:r>
-            <w:instrText xml:space="preserve"> PAGEREF _Toc28039 \h </w:instrText>
-          </w:r>
-          <w:r>
-            <w:fldChar w:fldCharType="separate"/>
-          </w:r>
-          <w:r>
-            <w:t>28</w:t>
-          </w:r>
-          <w:r>
-            <w:fldChar w:fldCharType="end"/>
-          </w:r>
-          <w:r>
-            <w:fldChar w:fldCharType="end"/>
-          </w:r>
-        </w:p>
-        <w:p>
-          <w:pPr>
-            <w:pStyle w:val="29"/>
-            <w:tabs>
-              <w:tab w:val="right" w:leader="dot" w:pos="9360"/>
-            </w:tabs>
-          </w:pPr>
-          <w:r>
-            <w:fldChar w:fldCharType="begin"/>
-          </w:r>
-          <w:r>
-            <w:instrText xml:space="preserve"> HYPERLINK \l _Toc1910 </w:instrText>
-          </w:r>
-          <w:r>
-            <w:fldChar w:fldCharType="separate"/>
-          </w:r>
-          <w:r>
-            <w:rPr>
-              <w:rFonts w:ascii="黑体" w:hAnsi="黑体" w:eastAsia="黑体" w:cs="黑体"/>
-            </w:rPr>
-            <w:t>13.2 发布检查表</w:t>
-          </w:r>
-          <w:r>
-            <w:tab/>
-          </w:r>
-          <w:r>
-            <w:fldChar w:fldCharType="begin"/>
-          </w:r>
-          <w:r>
-            <w:instrText xml:space="preserve"> PAGEREF _Toc1910 \h </w:instrText>
-          </w:r>
-          <w:r>
-            <w:fldChar w:fldCharType="separate"/>
-          </w:r>
-          <w:r>
-            <w:t>28</w:t>
-          </w:r>
-          <w:r>
-            <w:fldChar w:fldCharType="end"/>
-          </w:r>
-          <w:r>
-            <w:fldChar w:fldCharType="end"/>
-          </w:r>
-        </w:p>
-        <w:p>
-          <w:pPr>
-            <w:pStyle w:val="29"/>
-            <w:tabs>
-              <w:tab w:val="right" w:leader="dot" w:pos="9360"/>
-            </w:tabs>
-          </w:pPr>
-          <w:r>
-            <w:fldChar w:fldCharType="begin"/>
-          </w:r>
-          <w:r>
-            <w:instrText xml:space="preserve"> HYPERLINK \l _Toc19110 </w:instrText>
-          </w:r>
-          <w:r>
-            <w:fldChar w:fldCharType="separate"/>
-          </w:r>
-          <w:r>
-            <w:rPr>
-              <w:rFonts w:ascii="黑体" w:hAnsi="黑体" w:eastAsia="黑体" w:cs="黑体"/>
-            </w:rPr>
-            <w:t>13.3 扩展开发建议</w:t>
-          </w:r>
-          <w:r>
-            <w:tab/>
-          </w:r>
-          <w:r>
-            <w:fldChar w:fldCharType="begin"/>
-          </w:r>
-          <w:r>
-            <w:instrText xml:space="preserve"> PAGEREF _Toc19110 \h </w:instrText>
-          </w:r>
-          <w:r>
-            <w:fldChar w:fldCharType="separate"/>
-          </w:r>
-          <w:r>
-            <w:t>28</w:t>
-          </w:r>
-          <w:r>
-            <w:fldChar w:fldCharType="end"/>
-          </w:r>
-          <w:r>
-            <w:fldChar w:fldCharType="end"/>
-          </w:r>
-        </w:p>
-        <w:p>
-          <w:pPr>
-            <w:pStyle w:val="26"/>
-            <w:tabs>
-              <w:tab w:val="right" w:leader="dot" w:pos="9360"/>
-            </w:tabs>
-          </w:pPr>
-          <w:r>
-            <w:fldChar w:fldCharType="begin"/>
-          </w:r>
-          <w:r>
-            <w:instrText xml:space="preserve"> HYPERLINK \l _Toc28624 </w:instrText>
-          </w:r>
-          <w:r>
-            <w:fldChar w:fldCharType="separate"/>
-          </w:r>
-          <w:r>
-            <w:rPr>
-              <w:rFonts w:ascii="黑体" w:hAnsi="黑体" w:eastAsia="黑体" w:cs="黑体"/>
-            </w:rPr>
-            <w:t>14  附录</w:t>
-          </w:r>
-          <w:r>
-            <w:tab/>
-          </w:r>
-          <w:r>
-            <w:fldChar w:fldCharType="begin"/>
-          </w:r>
-          <w:r>
-            <w:instrText xml:space="preserve"> PAGEREF _Toc28624 \h </w:instrText>
-          </w:r>
-          <w:r>
-            <w:fldChar w:fldCharType="separate"/>
-          </w:r>
-          <w:r>
-            <w:t>29</w:t>
-          </w:r>
-          <w:r>
-            <w:fldChar w:fldCharType="end"/>
-          </w:r>
-          <w:r>
-            <w:fldChar w:fldCharType="end"/>
-          </w:r>
-        </w:p>
-        <w:p>
-          <w:pPr>
-            <w:pStyle w:val="29"/>
-            <w:tabs>
-              <w:tab w:val="right" w:leader="dot" w:pos="9360"/>
-            </w:tabs>
-          </w:pPr>
-          <w:r>
-            <w:fldChar w:fldCharType="begin"/>
-          </w:r>
-          <w:r>
-            <w:instrText xml:space="preserve"> HYPERLINK \l _Toc3860 </w:instrText>
-          </w:r>
-          <w:r>
-            <w:fldChar w:fldCharType="separate"/>
-          </w:r>
-          <w:r>
-            <w:rPr>
-              <w:rFonts w:ascii="黑体" w:hAnsi="黑体" w:eastAsia="黑体" w:cs="黑体"/>
-            </w:rPr>
-            <w:t>14.1 常用命令</w:t>
-          </w:r>
-          <w:r>
-            <w:tab/>
-          </w:r>
-          <w:r>
-            <w:fldChar w:fldCharType="begin"/>
-          </w:r>
-          <w:r>
-            <w:instrText xml:space="preserve"> PAGEREF _Toc3860 \h </w:instrText>
-          </w:r>
-          <w:r>
-            <w:fldChar w:fldCharType="separate"/>
-          </w:r>
-          <w:r>
-            <w:t>29</w:t>
-          </w:r>
-          <w:r>
-            <w:fldChar w:fldCharType="end"/>
-          </w:r>
-          <w:r>
-            <w:fldChar w:fldCharType="end"/>
-          </w:r>
-        </w:p>
-        <w:p>
-          <w:pPr>
-            <w:pStyle w:val="29"/>
-            <w:tabs>
-              <w:tab w:val="right" w:leader="dot" w:pos="9360"/>
-            </w:tabs>
-          </w:pPr>
-          <w:r>
-            <w:fldChar w:fldCharType="begin"/>
-          </w:r>
-          <w:r>
-            <w:instrText xml:space="preserve"> HYPERLINK \l _Toc13360 </w:instrText>
-          </w:r>
-          <w:r>
-            <w:fldChar w:fldCharType="separate"/>
-          </w:r>
-          <w:r>
-            <w:rPr>
-              <w:rFonts w:ascii="黑体" w:hAnsi="黑体" w:eastAsia="黑体" w:cs="黑体"/>
-            </w:rPr>
-            <w:t>14.2 关键常量</w:t>
-          </w:r>
-          <w:r>
-            <w:tab/>
-          </w:r>
-          <w:r>
-            <w:fldChar w:fldCharType="begin"/>
-          </w:r>
-          <w:r>
-            <w:instrText xml:space="preserve"> PAGEREF _Toc13360 \h </w:instrText>
-          </w:r>
-          <w:r>
-            <w:fldChar w:fldCharType="separate"/>
-          </w:r>
-          <w:r>
-            <w:t>29</w:t>
-          </w:r>
-          <w:r>
-            <w:fldChar w:fldCharType="end"/>
-          </w:r>
-          <w:r>
-            <w:fldChar w:fldCharType="end"/>
-          </w:r>
-        </w:p>
-        <w:p>
-          <w:pPr>
-            <w:pStyle w:val="29"/>
-            <w:tabs>
-              <w:tab w:val="right" w:leader="dot" w:pos="9360"/>
-            </w:tabs>
-          </w:pPr>
-          <w:r>
-            <w:fldChar w:fldCharType="begin"/>
-          </w:r>
-          <w:r>
-            <w:instrText xml:space="preserve"> HYPERLINK \l _Toc28303 </w:instrText>
+            <w:instrText xml:space="preserve"> HYPERLINK \l _Toc24865 </w:instrText>
           </w:r>
           <w:r>
             <w:fldChar w:fldCharType="separate"/>
@@ -3624,7 +3589,7 @@
             <w:fldChar w:fldCharType="begin"/>
           </w:r>
           <w:r>
-            <w:instrText xml:space="preserve"> PAGEREF _Toc28303 \h </w:instrText>
+            <w:instrText xml:space="preserve"> PAGEREF _Toc24865 \h </w:instrText>
           </w:r>
           <w:r>
             <w:fldChar w:fldCharType="separate"/>
@@ -3640,6 +3605,15 @@
           </w:r>
         </w:p>
         <w:p>
+          <w:pPr>
+            <w:rPr>
+              <w:rFonts w:ascii="宋体" w:hAnsi="宋体" w:eastAsia="宋体" w:cstheme="minorBidi"/>
+              <w:color w:val="111827"/>
+              <w:sz w:val="24"/>
+              <w:szCs w:val="22"/>
+              <w:lang w:val="en-US" w:eastAsia="en-US" w:bidi="ar-SA"/>
+            </w:rPr>
+          </w:pPr>
           <w:r>
             <w:fldChar w:fldCharType="end"/>
           </w:r>
@@ -3648,9 +3622,75 @@
     </w:sdt>
     <w:p>
       <w:pPr>
+        <w:rPr>
+          <w:rFonts w:ascii="宋体" w:hAnsi="宋体" w:eastAsia="宋体" w:cstheme="minorBidi"/>
+          <w:color w:val="111827"/>
+          <w:sz w:val="24"/>
+          <w:szCs w:val="22"/>
+          <w:lang w:val="en-US" w:eastAsia="en-US" w:bidi="ar-SA"/>
+        </w:rPr>
+      </w:pPr>
+    </w:p>
+    <w:p>
+      <w:pPr>
+        <w:rPr>
+          <w:rFonts w:ascii="宋体" w:hAnsi="宋体" w:eastAsia="宋体" w:cstheme="minorBidi"/>
+          <w:color w:val="111827"/>
+          <w:sz w:val="24"/>
+          <w:szCs w:val="22"/>
+          <w:lang w:val="en-US" w:eastAsia="en-US" w:bidi="ar-SA"/>
+        </w:rPr>
+      </w:pPr>
+    </w:p>
+    <w:p>
+      <w:pPr>
+        <w:rPr>
+          <w:rFonts w:ascii="宋体" w:hAnsi="宋体" w:eastAsia="宋体" w:cstheme="minorBidi"/>
+          <w:color w:val="111827"/>
+          <w:sz w:val="24"/>
+          <w:szCs w:val="22"/>
+          <w:lang w:val="en-US" w:eastAsia="en-US" w:bidi="ar-SA"/>
+        </w:rPr>
+      </w:pPr>
+    </w:p>
+    <w:p>
+      <w:pPr>
+        <w:rPr>
+          <w:rFonts w:ascii="宋体" w:hAnsi="宋体" w:eastAsia="宋体" w:cstheme="minorBidi"/>
+          <w:color w:val="111827"/>
+          <w:sz w:val="24"/>
+          <w:szCs w:val="22"/>
+          <w:lang w:val="en-US" w:eastAsia="en-US" w:bidi="ar-SA"/>
+        </w:rPr>
+      </w:pPr>
+    </w:p>
+    <w:p>
+      <w:pPr>
+        <w:rPr>
+          <w:rFonts w:ascii="宋体" w:hAnsi="宋体" w:eastAsia="宋体" w:cstheme="minorBidi"/>
+          <w:color w:val="111827"/>
+          <w:sz w:val="24"/>
+          <w:szCs w:val="22"/>
+          <w:lang w:val="en-US" w:eastAsia="en-US" w:bidi="ar-SA"/>
+        </w:rPr>
+      </w:pPr>
+    </w:p>
+    <w:p>
+      <w:pPr>
+        <w:rPr>
+          <w:rFonts w:ascii="宋体" w:hAnsi="宋体" w:eastAsia="宋体" w:cstheme="minorBidi"/>
+          <w:color w:val="111827"/>
+          <w:sz w:val="24"/>
+          <w:szCs w:val="22"/>
+          <w:lang w:val="en-US" w:eastAsia="en-US" w:bidi="ar-SA"/>
+        </w:rPr>
+      </w:pPr>
+    </w:p>
+    <w:p>
+      <w:pPr>
         <w:pStyle w:val="3"/>
       </w:pPr>
-      <w:bookmarkStart w:id="0" w:name="_Toc7190"/>
+      <w:bookmarkStart w:id="0" w:name="_Toc15916"/>
       <w:r>
         <w:rPr>
           <w:rFonts w:ascii="黑体" w:hAnsi="黑体" w:eastAsia="黑体" w:cs="黑体"/>
@@ -4236,7 +4276,7 @@
       <w:pPr>
         <w:pStyle w:val="4"/>
       </w:pPr>
-      <w:bookmarkStart w:id="1" w:name="_Toc20298"/>
+      <w:bookmarkStart w:id="1" w:name="_Toc611"/>
       <w:r>
         <w:rPr>
           <w:rFonts w:ascii="黑体" w:hAnsi="黑体" w:eastAsia="黑体" w:cs="黑体"/>
@@ -4244,6 +4284,8 @@
         <w:t>修订记录</w:t>
       </w:r>
       <w:bookmarkEnd w:id="1"/>
+      <w:bookmarkStart w:id="73" w:name="_GoBack"/>
+      <w:bookmarkEnd w:id="73"/>
     </w:p>
     <w:tbl>
       <w:tblPr>
@@ -4390,6 +4432,12 @@
             <w:insideH w:val="single" w:color="auto" w:sz="4" w:space="0"/>
             <w:insideV w:val="single" w:color="auto" w:sz="4" w:space="0"/>
           </w:tblBorders>
+          <w:tblCellMar>
+            <w:top w:w="0" w:type="dxa"/>
+            <w:left w:w="108" w:type="dxa"/>
+            <w:bottom w:w="0" w:type="dxa"/>
+            <w:right w:w="108" w:type="dxa"/>
+          </w:tblCellMar>
         </w:tblPrEx>
         <w:trPr>
           <w:cantSplit/>
@@ -4489,7 +4537,7 @@
       <w:pPr>
         <w:pStyle w:val="4"/>
       </w:pPr>
-      <w:bookmarkStart w:id="2" w:name="_Toc9497"/>
+      <w:bookmarkStart w:id="2" w:name="_Toc28292"/>
       <w:r>
         <w:rPr>
           <w:rFonts w:ascii="黑体" w:hAnsi="黑体" w:eastAsia="黑体" w:cs="黑体"/>
@@ -4539,43 +4587,6 @@
         </w:rPr>
         <w:t>PC6M-10 属于功率控制设备。常规开发、烧写和功能验证应断开市电、SCR 门极及功率负载，仅使用隔离限流控制电。强电带载测试须另行进行风险评估并由具备资质的人员实施。</w:t>
       </w:r>
-    </w:p>
-    <w:p>
-      <w:pPr>
-        <w:pStyle w:val="3"/>
-      </w:pPr>
-      <w:bookmarkStart w:id="3" w:name="_Toc1370"/>
-      <w:r>
-        <w:rPr>
-          <w:rFonts w:ascii="黑体" w:hAnsi="黑体" w:eastAsia="黑体" w:cs="黑体"/>
-        </w:rPr>
-        <w:t>目录</w:t>
-      </w:r>
-      <w:bookmarkEnd w:id="3"/>
-    </w:p>
-    <w:p>
-      <w:pPr>
-        <w:ind w:firstLine="0"/>
-      </w:pPr>
-      <w:r>
-        <w:fldChar w:fldCharType="begin"/>
-      </w:r>
-      <w:r>
-        <w:instrText xml:space="preserve">TOC \o "1-3" \h \z \u</w:instrText>
-      </w:r>
-      <w:r>
-        <w:fldChar w:fldCharType="separate"/>
-      </w:r>
-      <w:r>
-        <w:t>在 Word 中更新域以刷新目录</w:t>
-      </w:r>
-      <w:r>
-        <w:fldChar w:fldCharType="end"/>
-      </w:r>
-    </w:p>
-    <w:p>
-      <w:bookmarkStart w:id="74" w:name="_GoBack"/>
-      <w:bookmarkEnd w:id="74"/>
       <w:r>
         <w:br w:type="page"/>
       </w:r>
@@ -4584,27 +4595,27 @@
       <w:pPr>
         <w:pStyle w:val="3"/>
       </w:pPr>
-      <w:bookmarkStart w:id="4" w:name="_Toc28604"/>
+      <w:bookmarkStart w:id="3" w:name="_Toc13440"/>
       <w:r>
         <w:rPr>
           <w:rFonts w:ascii="黑体" w:hAnsi="黑体" w:eastAsia="黑体" w:cs="黑体"/>
         </w:rPr>
         <w:t>1  项目背景</w:t>
       </w:r>
-      <w:bookmarkEnd w:id="4"/>
+      <w:bookmarkEnd w:id="3"/>
     </w:p>
     <w:p>
       <w:pPr>
         <w:pStyle w:val="4"/>
       </w:pPr>
-      <w:bookmarkStart w:id="5" w:name="_Toc16022"/>
+      <w:bookmarkStart w:id="4" w:name="_Toc25949"/>
       <w:r>
         <w:rPr>
           <w:rFonts w:ascii="黑体" w:hAnsi="黑体" w:eastAsia="黑体" w:cs="黑体"/>
         </w:rPr>
         <w:t>1.1 产品背景</w:t>
       </w:r>
-      <w:bookmarkEnd w:id="5"/>
+      <w:bookmarkEnd w:id="4"/>
     </w:p>
     <w:p>
       <w:r>
@@ -4634,14 +4645,14 @@
       <w:pPr>
         <w:pStyle w:val="4"/>
       </w:pPr>
-      <w:bookmarkStart w:id="6" w:name="_Toc22967"/>
+      <w:bookmarkStart w:id="5" w:name="_Toc9349"/>
       <w:r>
         <w:rPr>
           <w:rFonts w:ascii="黑体" w:hAnsi="黑体" w:eastAsia="黑体" w:cs="黑体"/>
         </w:rPr>
         <w:t>1.2 建设目标</w:t>
       </w:r>
-      <w:bookmarkEnd w:id="6"/>
+      <w:bookmarkEnd w:id="5"/>
     </w:p>
     <w:p>
       <w:pPr>
@@ -4752,14 +4763,14 @@
       <w:pPr>
         <w:pStyle w:val="4"/>
       </w:pPr>
-      <w:bookmarkStart w:id="7" w:name="_Toc7226"/>
+      <w:bookmarkStart w:id="6" w:name="_Toc9029"/>
       <w:r>
         <w:rPr>
           <w:rFonts w:ascii="黑体" w:hAnsi="黑体" w:eastAsia="黑体" w:cs="黑体"/>
         </w:rPr>
         <w:t>1.3 设计范围</w:t>
       </w:r>
-      <w:bookmarkEnd w:id="7"/>
+      <w:bookmarkEnd w:id="6"/>
     </w:p>
     <w:tbl>
       <w:tblPr>
@@ -4796,6 +4807,12 @@
             <w:insideH w:val="single" w:color="auto" w:sz="4" w:space="0"/>
             <w:insideV w:val="single" w:color="auto" w:sz="4" w:space="0"/>
           </w:tblBorders>
+          <w:tblCellMar>
+            <w:top w:w="0" w:type="dxa"/>
+            <w:left w:w="108" w:type="dxa"/>
+            <w:bottom w:w="0" w:type="dxa"/>
+            <w:right w:w="108" w:type="dxa"/>
+          </w:tblCellMar>
         </w:tblPrEx>
         <w:trPr>
           <w:cantSplit/>
@@ -4947,14 +4964,14 @@
       <w:pPr>
         <w:pStyle w:val="4"/>
       </w:pPr>
-      <w:bookmarkStart w:id="8" w:name="_Toc22573"/>
+      <w:bookmarkStart w:id="7" w:name="_Toc7693"/>
       <w:r>
         <w:rPr>
           <w:rFonts w:ascii="黑体" w:hAnsi="黑体" w:eastAsia="黑体" w:cs="黑体"/>
         </w:rPr>
         <w:t>1.4 关键质量属性</w:t>
       </w:r>
-      <w:bookmarkEnd w:id="8"/>
+      <w:bookmarkEnd w:id="7"/>
     </w:p>
     <w:tbl>
       <w:tblPr>
@@ -5456,27 +5473,27 @@
       <w:pPr>
         <w:pStyle w:val="3"/>
       </w:pPr>
-      <w:bookmarkStart w:id="9" w:name="_Toc7243"/>
+      <w:bookmarkStart w:id="8" w:name="_Toc1415"/>
       <w:r>
         <w:rPr>
           <w:rFonts w:ascii="黑体" w:hAnsi="黑体" w:eastAsia="黑体" w:cs="黑体"/>
         </w:rPr>
         <w:t>2  系统概述</w:t>
       </w:r>
-      <w:bookmarkEnd w:id="9"/>
+      <w:bookmarkEnd w:id="8"/>
     </w:p>
     <w:p>
       <w:pPr>
         <w:pStyle w:val="4"/>
       </w:pPr>
-      <w:bookmarkStart w:id="10" w:name="_Toc8382"/>
+      <w:bookmarkStart w:id="9" w:name="_Toc20697"/>
       <w:r>
         <w:rPr>
           <w:rFonts w:ascii="黑体" w:hAnsi="黑体" w:eastAsia="黑体" w:cs="黑体"/>
         </w:rPr>
         <w:t>2.1 硬件平台</w:t>
       </w:r>
-      <w:bookmarkEnd w:id="10"/>
+      <w:bookmarkEnd w:id="9"/>
     </w:p>
     <w:tbl>
       <w:tblPr>
@@ -6286,14 +6303,14 @@
       <w:pPr>
         <w:pStyle w:val="4"/>
       </w:pPr>
-      <w:bookmarkStart w:id="11" w:name="_Toc14063"/>
+      <w:bookmarkStart w:id="10" w:name="_Toc3606"/>
       <w:r>
         <w:rPr>
           <w:rFonts w:ascii="黑体" w:hAnsi="黑体" w:eastAsia="黑体" w:cs="黑体"/>
         </w:rPr>
         <w:t>2.2 软件运行模型</w:t>
       </w:r>
-      <w:bookmarkEnd w:id="11"/>
+      <w:bookmarkEnd w:id="10"/>
     </w:p>
     <w:p>
       <w:r>
@@ -6517,14 +6534,14 @@
       <w:pPr>
         <w:pStyle w:val="4"/>
       </w:pPr>
-      <w:bookmarkStart w:id="12" w:name="_Toc2030"/>
+      <w:bookmarkStart w:id="11" w:name="_Toc19312"/>
       <w:r>
         <w:rPr>
           <w:rFonts w:ascii="黑体" w:hAnsi="黑体" w:eastAsia="黑体" w:cs="黑体"/>
         </w:rPr>
         <w:t>2.3 分层架构</w:t>
       </w:r>
-      <w:bookmarkEnd w:id="12"/>
+      <w:bookmarkEnd w:id="11"/>
     </w:p>
     <w:tbl>
       <w:tblPr>
@@ -7196,27 +7213,27 @@
       <w:pPr>
         <w:pStyle w:val="3"/>
       </w:pPr>
-      <w:bookmarkStart w:id="13" w:name="_Toc8105"/>
+      <w:bookmarkStart w:id="12" w:name="_Toc31776"/>
       <w:r>
         <w:rPr>
           <w:rFonts w:ascii="黑体" w:hAnsi="黑体" w:eastAsia="黑体" w:cs="黑体"/>
         </w:rPr>
         <w:t>3  软件总体设计</w:t>
       </w:r>
-      <w:bookmarkEnd w:id="13"/>
+      <w:bookmarkEnd w:id="12"/>
     </w:p>
     <w:p>
       <w:pPr>
         <w:pStyle w:val="4"/>
       </w:pPr>
-      <w:bookmarkStart w:id="14" w:name="_Toc10240"/>
+      <w:bookmarkStart w:id="13" w:name="_Toc6156"/>
       <w:r>
         <w:rPr>
           <w:rFonts w:ascii="黑体" w:hAnsi="黑体" w:eastAsia="黑体" w:cs="黑体"/>
         </w:rPr>
         <w:t>3.1 启动流程</w:t>
       </w:r>
-      <w:bookmarkEnd w:id="14"/>
+      <w:bookmarkEnd w:id="13"/>
     </w:p>
     <w:tbl>
       <w:tblPr>
@@ -8203,14 +8220,14 @@
       <w:pPr>
         <w:pStyle w:val="4"/>
       </w:pPr>
-      <w:bookmarkStart w:id="15" w:name="_Toc4437"/>
+      <w:bookmarkStart w:id="14" w:name="_Toc16838"/>
       <w:r>
         <w:rPr>
           <w:rFonts w:ascii="黑体" w:hAnsi="黑体" w:eastAsia="黑体" w:cs="黑体"/>
         </w:rPr>
         <w:t>3.2 内存布局</w:t>
       </w:r>
-      <w:bookmarkEnd w:id="15"/>
+      <w:bookmarkEnd w:id="14"/>
     </w:p>
     <w:tbl>
       <w:tblPr>
@@ -8894,14 +8911,14 @@
       <w:pPr>
         <w:pStyle w:val="4"/>
       </w:pPr>
-      <w:bookmarkStart w:id="16" w:name="_Toc15225"/>
+      <w:bookmarkStart w:id="15" w:name="_Toc30155"/>
       <w:r>
         <w:rPr>
           <w:rFonts w:ascii="黑体" w:hAnsi="黑体" w:eastAsia="黑体" w:cs="黑体"/>
         </w:rPr>
         <w:t>3.3 中断体系</w:t>
       </w:r>
-      <w:bookmarkEnd w:id="16"/>
+      <w:bookmarkEnd w:id="15"/>
     </w:p>
     <w:tbl>
       <w:tblPr>
@@ -9690,14 +9707,14 @@
       <w:pPr>
         <w:pStyle w:val="4"/>
       </w:pPr>
-      <w:bookmarkStart w:id="17" w:name="_Toc787"/>
+      <w:bookmarkStart w:id="16" w:name="_Toc2320"/>
       <w:r>
         <w:rPr>
           <w:rFonts w:ascii="黑体" w:hAnsi="黑体" w:eastAsia="黑体" w:cs="黑体"/>
         </w:rPr>
         <w:t>3.4 安全状态</w:t>
       </w:r>
-      <w:bookmarkEnd w:id="17"/>
+      <w:bookmarkEnd w:id="16"/>
     </w:p>
     <w:p>
       <w:r>
@@ -9715,14 +9732,14 @@
       <w:pPr>
         <w:pStyle w:val="3"/>
       </w:pPr>
-      <w:bookmarkStart w:id="18" w:name="_Toc12516"/>
+      <w:bookmarkStart w:id="17" w:name="_Toc14451"/>
       <w:r>
         <w:rPr>
           <w:rFonts w:ascii="黑体" w:hAnsi="黑体" w:eastAsia="黑体" w:cs="黑体"/>
         </w:rPr>
         <w:t>4  模块详细设计</w:t>
       </w:r>
-      <w:bookmarkEnd w:id="18"/>
+      <w:bookmarkEnd w:id="17"/>
     </w:p>
     <w:tbl>
       <w:tblPr>
@@ -11339,14 +11356,14 @@
       <w:pPr>
         <w:pStyle w:val="4"/>
       </w:pPr>
-      <w:bookmarkStart w:id="19" w:name="_Toc21894"/>
+      <w:bookmarkStart w:id="18" w:name="_Toc18719"/>
       <w:r>
         <w:rPr>
           <w:rFonts w:ascii="黑体" w:hAnsi="黑体" w:eastAsia="黑体" w:cs="黑体"/>
         </w:rPr>
         <w:t>4.1 启动与系统调度</w:t>
       </w:r>
-      <w:bookmarkEnd w:id="19"/>
+      <w:bookmarkEnd w:id="18"/>
     </w:p>
     <w:p>
       <w:r>
@@ -11376,14 +11393,14 @@
       <w:pPr>
         <w:pStyle w:val="4"/>
       </w:pPr>
-      <w:bookmarkStart w:id="20" w:name="_Toc27024"/>
+      <w:bookmarkStart w:id="19" w:name="_Toc27471"/>
       <w:r>
         <w:rPr>
           <w:rFonts w:ascii="黑体" w:hAnsi="黑体" w:eastAsia="黑体" w:cs="黑体"/>
         </w:rPr>
         <w:t>4.2 LCD 显示</w:t>
       </w:r>
-      <w:bookmarkEnd w:id="20"/>
+      <w:bookmarkEnd w:id="19"/>
     </w:p>
     <w:p>
       <w:r>
@@ -11446,14 +11463,14 @@
       <w:pPr>
         <w:pStyle w:val="4"/>
       </w:pPr>
-      <w:bookmarkStart w:id="21" w:name="_Toc17170"/>
+      <w:bookmarkStart w:id="20" w:name="_Toc13847"/>
       <w:r>
         <w:rPr>
           <w:rFonts w:ascii="黑体" w:hAnsi="黑体" w:eastAsia="黑体" w:cs="黑体"/>
         </w:rPr>
         <w:t>4.3 输入扫描与事件</w:t>
       </w:r>
-      <w:bookmarkEnd w:id="21"/>
+      <w:bookmarkEnd w:id="20"/>
     </w:p>
     <w:tbl>
       <w:tblPr>
@@ -12347,14 +12364,14 @@
       <w:pPr>
         <w:pStyle w:val="4"/>
       </w:pPr>
-      <w:bookmarkStart w:id="22" w:name="_Toc25435"/>
+      <w:bookmarkStart w:id="21" w:name="_Toc30696"/>
       <w:r>
         <w:rPr>
           <w:rFonts w:ascii="黑体" w:hAnsi="黑体" w:eastAsia="黑体" w:cs="黑体"/>
         </w:rPr>
         <w:t>4.4 EEPROM 与参数系统</w:t>
       </w:r>
-      <w:bookmarkEnd w:id="22"/>
+      <w:bookmarkEnd w:id="21"/>
     </w:p>
     <w:p>
       <w:r>
@@ -12414,14 +12431,14 @@
       <w:pPr>
         <w:pStyle w:val="4"/>
       </w:pPr>
-      <w:bookmarkStart w:id="23" w:name="_Toc29437"/>
+      <w:bookmarkStart w:id="22" w:name="_Toc26987"/>
       <w:r>
         <w:rPr>
           <w:rFonts w:ascii="黑体" w:hAnsi="黑体" w:eastAsia="黑体" w:cs="黑体"/>
         </w:rPr>
         <w:t>4.5 ADC 数据采集</w:t>
       </w:r>
-      <w:bookmarkEnd w:id="23"/>
+      <w:bookmarkEnd w:id="22"/>
     </w:p>
     <w:tbl>
       <w:tblPr>
@@ -13210,14 +13227,14 @@
       <w:pPr>
         <w:pStyle w:val="4"/>
       </w:pPr>
-      <w:bookmarkStart w:id="24" w:name="_Toc19920"/>
+      <w:bookmarkStart w:id="23" w:name="_Toc22447"/>
       <w:r>
         <w:rPr>
           <w:rFonts w:ascii="黑体" w:hAnsi="黑体" w:eastAsia="黑体" w:cs="黑体"/>
         </w:rPr>
         <w:t>4.6 状态机与菜单</w:t>
       </w:r>
-      <w:bookmarkEnd w:id="24"/>
+      <w:bookmarkEnd w:id="23"/>
     </w:p>
     <w:p>
       <w:r>
@@ -14018,14 +14035,14 @@
       <w:pPr>
         <w:pStyle w:val="4"/>
       </w:pPr>
-      <w:bookmarkStart w:id="25" w:name="_Toc20125"/>
+      <w:bookmarkStart w:id="24" w:name="_Toc19817"/>
       <w:r>
         <w:rPr>
           <w:rFonts w:ascii="黑体" w:hAnsi="黑体" w:eastAsia="黑体" w:cs="黑体"/>
         </w:rPr>
         <w:t>4.7 UART3 与 Modbus-RTU</w:t>
       </w:r>
-      <w:bookmarkEnd w:id="25"/>
+      <w:bookmarkEnd w:id="24"/>
     </w:p>
     <w:p>
       <w:r>
@@ -14511,14 +14528,14 @@
       <w:pPr>
         <w:pStyle w:val="4"/>
       </w:pPr>
-      <w:bookmarkStart w:id="26" w:name="_Toc19734"/>
+      <w:bookmarkStart w:id="25" w:name="_Toc20437"/>
       <w:r>
         <w:rPr>
           <w:rFonts w:ascii="黑体" w:hAnsi="黑体" w:eastAsia="黑体" w:cs="黑体"/>
         </w:rPr>
         <w:t>4.8 输出级与触发时序</w:t>
       </w:r>
-      <w:bookmarkEnd w:id="26"/>
+      <w:bookmarkEnd w:id="25"/>
     </w:p>
     <w:p>
       <w:r>
@@ -14568,6 +14585,12 @@
             <w:insideH w:val="single" w:color="auto" w:sz="4" w:space="0"/>
             <w:insideV w:val="single" w:color="auto" w:sz="4" w:space="0"/>
           </w:tblBorders>
+          <w:tblCellMar>
+            <w:top w:w="0" w:type="dxa"/>
+            <w:left w:w="108" w:type="dxa"/>
+            <w:bottom w:w="0" w:type="dxa"/>
+            <w:right w:w="108" w:type="dxa"/>
+          </w:tblCellMar>
         </w:tblPrEx>
         <w:trPr>
           <w:cantSplit/>
@@ -15103,14 +15126,14 @@
       <w:pPr>
         <w:pStyle w:val="4"/>
       </w:pPr>
-      <w:bookmarkStart w:id="27" w:name="_Toc28924"/>
+      <w:bookmarkStart w:id="26" w:name="_Toc28215"/>
       <w:r>
         <w:rPr>
           <w:rFonts w:ascii="黑体" w:hAnsi="黑体" w:eastAsia="黑体" w:cs="黑体"/>
         </w:rPr>
         <w:t>4.9 闭环控制</w:t>
       </w:r>
-      <w:bookmarkEnd w:id="27"/>
+      <w:bookmarkEnd w:id="26"/>
     </w:p>
     <w:p>
       <w:r>
@@ -15173,14 +15196,14 @@
       <w:pPr>
         <w:pStyle w:val="4"/>
       </w:pPr>
-      <w:bookmarkStart w:id="28" w:name="_Toc393"/>
+      <w:bookmarkStart w:id="27" w:name="_Toc28885"/>
       <w:r>
         <w:rPr>
           <w:rFonts w:ascii="黑体" w:hAnsi="黑体" w:eastAsia="黑体" w:cs="黑体"/>
         </w:rPr>
         <w:t>4.10 继电器、指示灯与设备识别</w:t>
       </w:r>
-      <w:bookmarkEnd w:id="28"/>
+      <w:bookmarkEnd w:id="27"/>
     </w:p>
     <w:p>
       <w:r>
@@ -15198,27 +15221,27 @@
       <w:pPr>
         <w:pStyle w:val="3"/>
       </w:pPr>
-      <w:bookmarkStart w:id="29" w:name="_Toc3224"/>
+      <w:bookmarkStart w:id="28" w:name="_Toc9116"/>
       <w:r>
         <w:rPr>
           <w:rFonts w:ascii="黑体" w:hAnsi="黑体" w:eastAsia="黑体" w:cs="黑体"/>
         </w:rPr>
         <w:t>5  数据与参数设计</w:t>
       </w:r>
-      <w:bookmarkEnd w:id="29"/>
+      <w:bookmarkEnd w:id="28"/>
     </w:p>
     <w:p>
       <w:pPr>
         <w:pStyle w:val="4"/>
       </w:pPr>
-      <w:bookmarkStart w:id="30" w:name="_Toc24823"/>
+      <w:bookmarkStart w:id="29" w:name="_Toc8078"/>
       <w:r>
         <w:rPr>
           <w:rFonts w:ascii="黑体" w:hAnsi="黑体" w:eastAsia="黑体" w:cs="黑体"/>
         </w:rPr>
         <w:t>5.1 全局数据分类</w:t>
       </w:r>
-      <w:bookmarkEnd w:id="30"/>
+      <w:bookmarkEnd w:id="29"/>
     </w:p>
     <w:tbl>
       <w:tblPr>
@@ -15995,14 +16018,14 @@
       <w:pPr>
         <w:pStyle w:val="4"/>
       </w:pPr>
-      <w:bookmarkStart w:id="31" w:name="_Toc16426"/>
+      <w:bookmarkStart w:id="30" w:name="_Toc25174"/>
       <w:r>
         <w:rPr>
           <w:rFonts w:ascii="黑体" w:hAnsi="黑体" w:eastAsia="黑体" w:cs="黑体"/>
         </w:rPr>
         <w:t>5.2 基本参数</w:t>
       </w:r>
-      <w:bookmarkEnd w:id="31"/>
+      <w:bookmarkEnd w:id="30"/>
     </w:p>
     <w:tbl>
       <w:tblPr>
@@ -17094,14 +17117,14 @@
       <w:pPr>
         <w:pStyle w:val="4"/>
       </w:pPr>
-      <w:bookmarkStart w:id="32" w:name="_Toc5837"/>
+      <w:bookmarkStart w:id="31" w:name="_Toc23509"/>
       <w:r>
         <w:rPr>
           <w:rFonts w:ascii="黑体" w:hAnsi="黑体" w:eastAsia="黑体" w:cs="黑体"/>
         </w:rPr>
         <w:t>5.3 保护参数</w:t>
       </w:r>
-      <w:bookmarkEnd w:id="32"/>
+      <w:bookmarkEnd w:id="31"/>
     </w:p>
     <w:tbl>
       <w:tblPr>
@@ -17878,14 +17901,14 @@
       <w:pPr>
         <w:pStyle w:val="4"/>
       </w:pPr>
-      <w:bookmarkStart w:id="33" w:name="_Toc23194"/>
+      <w:bookmarkStart w:id="32" w:name="_Toc14532"/>
       <w:r>
         <w:rPr>
           <w:rFonts w:ascii="黑体" w:hAnsi="黑体" w:eastAsia="黑体" w:cs="黑体"/>
         </w:rPr>
         <w:t>5.4 参数修改一致性</w:t>
       </w:r>
-      <w:bookmarkEnd w:id="33"/>
+      <w:bookmarkEnd w:id="32"/>
     </w:p>
     <w:p>
       <w:pPr>
@@ -17966,27 +17989,27 @@
       <w:pPr>
         <w:pStyle w:val="3"/>
       </w:pPr>
-      <w:bookmarkStart w:id="34" w:name="_Toc2757"/>
+      <w:bookmarkStart w:id="33" w:name="_Toc22756"/>
       <w:r>
         <w:rPr>
           <w:rFonts w:ascii="黑体" w:hAnsi="黑体" w:eastAsia="黑体" w:cs="黑体"/>
         </w:rPr>
         <w:t>6  外部接口设计</w:t>
       </w:r>
-      <w:bookmarkEnd w:id="34"/>
+      <w:bookmarkEnd w:id="33"/>
     </w:p>
     <w:p>
       <w:pPr>
         <w:pStyle w:val="4"/>
       </w:pPr>
-      <w:bookmarkStart w:id="35" w:name="_Toc20353"/>
+      <w:bookmarkStart w:id="34" w:name="_Toc23081"/>
       <w:r>
         <w:rPr>
           <w:rFonts w:ascii="黑体" w:hAnsi="黑体" w:eastAsia="黑体" w:cs="黑体"/>
         </w:rPr>
         <w:t>6.1 GPIO 接口</w:t>
       </w:r>
-      <w:bookmarkEnd w:id="35"/>
+      <w:bookmarkEnd w:id="34"/>
     </w:p>
     <w:tbl>
       <w:tblPr>
@@ -19003,14 +19026,14 @@
       <w:pPr>
         <w:pStyle w:val="4"/>
       </w:pPr>
-      <w:bookmarkStart w:id="36" w:name="_Toc27079"/>
+      <w:bookmarkStart w:id="35" w:name="_Toc24095"/>
       <w:r>
         <w:rPr>
           <w:rFonts w:ascii="黑体" w:hAnsi="黑体" w:eastAsia="黑体" w:cs="黑体"/>
         </w:rPr>
         <w:t>6.2 Modbus 常用寄存器</w:t>
       </w:r>
-      <w:bookmarkEnd w:id="36"/>
+      <w:bookmarkEnd w:id="35"/>
     </w:p>
     <w:tbl>
       <w:tblPr>
@@ -19453,12 +19476,6 @@
             <w:insideH w:val="single" w:color="auto" w:sz="4" w:space="0"/>
             <w:insideV w:val="single" w:color="auto" w:sz="4" w:space="0"/>
           </w:tblBorders>
-          <w:tblCellMar>
-            <w:top w:w="0" w:type="dxa"/>
-            <w:left w:w="108" w:type="dxa"/>
-            <w:bottom w:w="0" w:type="dxa"/>
-            <w:right w:w="108" w:type="dxa"/>
-          </w:tblCellMar>
         </w:tblPrEx>
         <w:trPr>
           <w:cantSplit/>
@@ -20130,14 +20147,14 @@
       <w:pPr>
         <w:pStyle w:val="4"/>
       </w:pPr>
-      <w:bookmarkStart w:id="37" w:name="_Toc26867"/>
+      <w:bookmarkStart w:id="36" w:name="_Toc29917"/>
       <w:r>
         <w:rPr>
           <w:rFonts w:ascii="黑体" w:hAnsi="黑体" w:eastAsia="黑体" w:cs="黑体"/>
         </w:rPr>
         <w:t>6.3 LCD 与本地操作</w:t>
       </w:r>
-      <w:bookmarkEnd w:id="37"/>
+      <w:bookmarkEnd w:id="36"/>
     </w:p>
     <w:p>
       <w:r>
@@ -20155,27 +20172,27 @@
       <w:pPr>
         <w:pStyle w:val="3"/>
       </w:pPr>
-      <w:bookmarkStart w:id="38" w:name="_Toc11043"/>
+      <w:bookmarkStart w:id="37" w:name="_Toc23287"/>
       <w:r>
         <w:rPr>
           <w:rFonts w:ascii="黑体" w:hAnsi="黑体" w:eastAsia="黑体" w:cs="黑体"/>
         </w:rPr>
         <w:t>7  控制流程设计</w:t>
       </w:r>
-      <w:bookmarkEnd w:id="38"/>
+      <w:bookmarkEnd w:id="37"/>
     </w:p>
     <w:p>
       <w:pPr>
         <w:pStyle w:val="4"/>
       </w:pPr>
-      <w:bookmarkStart w:id="39" w:name="_Toc26727"/>
+      <w:bookmarkStart w:id="38" w:name="_Toc13086"/>
       <w:r>
         <w:rPr>
           <w:rFonts w:ascii="黑体" w:hAnsi="黑体" w:eastAsia="黑体" w:cs="黑体"/>
         </w:rPr>
         <w:t>7.1 运行状态转换</w:t>
       </w:r>
-      <w:bookmarkEnd w:id="39"/>
+      <w:bookmarkEnd w:id="38"/>
     </w:p>
     <w:p>
       <w:pPr>
@@ -20369,14 +20386,14 @@
       <w:pPr>
         <w:pStyle w:val="4"/>
       </w:pPr>
-      <w:bookmarkStart w:id="40" w:name="_Toc7246"/>
+      <w:bookmarkStart w:id="39" w:name="_Toc12024"/>
       <w:r>
         <w:rPr>
           <w:rFonts w:ascii="黑体" w:hAnsi="黑体" w:eastAsia="黑体" w:cs="黑体"/>
         </w:rPr>
         <w:t>7.2 控制来源</w:t>
       </w:r>
-      <w:bookmarkEnd w:id="40"/>
+      <w:bookmarkEnd w:id="39"/>
     </w:p>
     <w:tbl>
       <w:tblPr>
@@ -20838,14 +20855,14 @@
       <w:pPr>
         <w:pStyle w:val="4"/>
       </w:pPr>
-      <w:bookmarkStart w:id="41" w:name="_Toc6126"/>
+      <w:bookmarkStart w:id="40" w:name="_Toc873"/>
       <w:r>
         <w:rPr>
           <w:rFonts w:ascii="黑体" w:hAnsi="黑体" w:eastAsia="黑体" w:cs="黑体"/>
         </w:rPr>
         <w:t>7.3 软起动与软停止</w:t>
       </w:r>
-      <w:bookmarkEnd w:id="41"/>
+      <w:bookmarkEnd w:id="40"/>
     </w:p>
     <w:p>
       <w:r>
@@ -20863,14 +20880,14 @@
       <w:pPr>
         <w:pStyle w:val="4"/>
       </w:pPr>
-      <w:bookmarkStart w:id="42" w:name="_Toc4035"/>
+      <w:bookmarkStart w:id="41" w:name="_Toc28491"/>
       <w:r>
         <w:rPr>
           <w:rFonts w:ascii="黑体" w:hAnsi="黑体" w:eastAsia="黑体" w:cs="黑体"/>
         </w:rPr>
         <w:t>7.4 故障与保护</w:t>
       </w:r>
-      <w:bookmarkEnd w:id="42"/>
+      <w:bookmarkEnd w:id="41"/>
     </w:p>
     <w:p>
       <w:r>
@@ -20888,27 +20905,27 @@
       <w:pPr>
         <w:pStyle w:val="3"/>
       </w:pPr>
-      <w:bookmarkStart w:id="43" w:name="_Toc5659"/>
+      <w:bookmarkStart w:id="42" w:name="_Toc27767"/>
       <w:r>
         <w:rPr>
           <w:rFonts w:ascii="黑体" w:hAnsi="黑体" w:eastAsia="黑体" w:cs="黑体"/>
         </w:rPr>
         <w:t>8  工程结构与编码规范</w:t>
       </w:r>
-      <w:bookmarkEnd w:id="43"/>
+      <w:bookmarkEnd w:id="42"/>
     </w:p>
     <w:p>
       <w:pPr>
         <w:pStyle w:val="4"/>
       </w:pPr>
-      <w:bookmarkStart w:id="44" w:name="_Toc28602"/>
+      <w:bookmarkStart w:id="43" w:name="_Toc32043"/>
       <w:r>
         <w:rPr>
           <w:rFonts w:ascii="黑体" w:hAnsi="黑体" w:eastAsia="黑体" w:cs="黑体"/>
         </w:rPr>
         <w:t>8.1 工程目录</w:t>
       </w:r>
-      <w:bookmarkEnd w:id="44"/>
+      <w:bookmarkEnd w:id="43"/>
     </w:p>
     <w:p>
       <w:pPr>
@@ -21170,14 +21187,14 @@
       <w:pPr>
         <w:pStyle w:val="4"/>
       </w:pPr>
-      <w:bookmarkStart w:id="45" w:name="_Toc14931"/>
+      <w:bookmarkStart w:id="44" w:name="_Toc4697"/>
       <w:r>
         <w:rPr>
           <w:rFonts w:ascii="黑体" w:hAnsi="黑体" w:eastAsia="黑体" w:cs="黑体"/>
         </w:rPr>
         <w:t>8.2 编码规范</w:t>
       </w:r>
-      <w:bookmarkEnd w:id="45"/>
+      <w:bookmarkEnd w:id="44"/>
     </w:p>
     <w:p>
       <w:pPr>
@@ -21303,14 +21320,14 @@
       <w:pPr>
         <w:pStyle w:val="4"/>
       </w:pPr>
-      <w:bookmarkStart w:id="46" w:name="_Toc15319"/>
+      <w:bookmarkStart w:id="45" w:name="_Toc7454"/>
       <w:r>
         <w:rPr>
           <w:rFonts w:ascii="黑体" w:hAnsi="黑体" w:eastAsia="黑体" w:cs="黑体"/>
         </w:rPr>
         <w:t>8.3 变更影响分析</w:t>
       </w:r>
-      <w:bookmarkEnd w:id="46"/>
+      <w:bookmarkEnd w:id="45"/>
     </w:p>
     <w:tbl>
       <w:tblPr>
@@ -21889,27 +21906,27 @@
       <w:pPr>
         <w:pStyle w:val="3"/>
       </w:pPr>
-      <w:bookmarkStart w:id="47" w:name="_Toc7251"/>
+      <w:bookmarkStart w:id="46" w:name="_Toc32077"/>
       <w:r>
         <w:rPr>
           <w:rFonts w:ascii="黑体" w:hAnsi="黑体" w:eastAsia="黑体" w:cs="黑体"/>
         </w:rPr>
         <w:t>9  构建与开发环境</w:t>
       </w:r>
-      <w:bookmarkEnd w:id="47"/>
+      <w:bookmarkEnd w:id="46"/>
     </w:p>
     <w:p>
       <w:pPr>
         <w:pStyle w:val="4"/>
       </w:pPr>
-      <w:bookmarkStart w:id="48" w:name="_Toc28919"/>
+      <w:bookmarkStart w:id="47" w:name="_Toc31995"/>
       <w:r>
         <w:rPr>
           <w:rFonts w:ascii="黑体" w:hAnsi="黑体" w:eastAsia="黑体" w:cs="黑体"/>
         </w:rPr>
         <w:t>9.1 工具依赖</w:t>
       </w:r>
-      <w:bookmarkEnd w:id="48"/>
+      <w:bookmarkEnd w:id="47"/>
     </w:p>
     <w:tbl>
       <w:tblPr>
@@ -21946,6 +21963,12 @@
             <w:insideH w:val="single" w:color="auto" w:sz="4" w:space="0"/>
             <w:insideV w:val="single" w:color="auto" w:sz="4" w:space="0"/>
           </w:tblBorders>
+          <w:tblCellMar>
+            <w:top w:w="0" w:type="dxa"/>
+            <w:left w:w="108" w:type="dxa"/>
+            <w:bottom w:w="0" w:type="dxa"/>
+            <w:right w:w="108" w:type="dxa"/>
+          </w:tblCellMar>
         </w:tblPrEx>
         <w:trPr>
           <w:cantSplit/>
@@ -22405,14 +22428,14 @@
       <w:pPr>
         <w:pStyle w:val="4"/>
       </w:pPr>
-      <w:bookmarkStart w:id="49" w:name="_Toc24880"/>
+      <w:bookmarkStart w:id="48" w:name="_Toc30769"/>
       <w:r>
         <w:rPr>
           <w:rFonts w:ascii="黑体" w:hAnsi="黑体" w:eastAsia="黑体" w:cs="黑体"/>
         </w:rPr>
         <w:t>9.2 编译参数</w:t>
       </w:r>
-      <w:bookmarkEnd w:id="49"/>
+      <w:bookmarkEnd w:id="48"/>
     </w:p>
     <w:p>
       <w:pPr>
@@ -22506,14 +22529,14 @@
       <w:pPr>
         <w:pStyle w:val="4"/>
       </w:pPr>
-      <w:bookmarkStart w:id="50" w:name="_Toc5320"/>
+      <w:bookmarkStart w:id="49" w:name="_Toc18169"/>
       <w:r>
         <w:rPr>
           <w:rFonts w:ascii="黑体" w:hAnsi="黑体" w:eastAsia="黑体" w:cs="黑体"/>
         </w:rPr>
         <w:t>9.3 标准构建</w:t>
       </w:r>
-      <w:bookmarkEnd w:id="50"/>
+      <w:bookmarkEnd w:id="49"/>
     </w:p>
     <w:p>
       <w:pPr>
@@ -22974,14 +22997,14 @@
       <w:pPr>
         <w:pStyle w:val="4"/>
       </w:pPr>
-      <w:bookmarkStart w:id="51" w:name="_Toc16676"/>
+      <w:bookmarkStart w:id="50" w:name="_Toc19412"/>
       <w:r>
         <w:rPr>
           <w:rFonts w:ascii="黑体" w:hAnsi="黑体" w:eastAsia="黑体" w:cs="黑体"/>
         </w:rPr>
         <w:t>9.4 构建后检查</w:t>
       </w:r>
-      <w:bookmarkEnd w:id="51"/>
+      <w:bookmarkEnd w:id="50"/>
     </w:p>
     <w:p>
       <w:pPr>
@@ -23077,27 +23100,27 @@
       <w:pPr>
         <w:pStyle w:val="3"/>
       </w:pPr>
-      <w:bookmarkStart w:id="52" w:name="_Toc10968"/>
+      <w:bookmarkStart w:id="51" w:name="_Toc4701"/>
       <w:r>
         <w:rPr>
           <w:rFonts w:ascii="黑体" w:hAnsi="黑体" w:eastAsia="黑体" w:cs="黑体"/>
         </w:rPr>
         <w:t>10  测试与质量保证</w:t>
       </w:r>
-      <w:bookmarkEnd w:id="52"/>
+      <w:bookmarkEnd w:id="51"/>
     </w:p>
     <w:p>
       <w:pPr>
         <w:pStyle w:val="4"/>
       </w:pPr>
-      <w:bookmarkStart w:id="53" w:name="_Toc5337"/>
+      <w:bookmarkStart w:id="52" w:name="_Toc1384"/>
       <w:r>
         <w:rPr>
           <w:rFonts w:ascii="黑体" w:hAnsi="黑体" w:eastAsia="黑体" w:cs="黑体"/>
         </w:rPr>
         <w:t>10.1 测试分层</w:t>
       </w:r>
-      <w:bookmarkEnd w:id="53"/>
+      <w:bookmarkEnd w:id="52"/>
     </w:p>
     <w:tbl>
       <w:tblPr>
@@ -23874,14 +23897,14 @@
       <w:pPr>
         <w:pStyle w:val="4"/>
       </w:pPr>
-      <w:bookmarkStart w:id="54" w:name="_Toc18219"/>
+      <w:bookmarkStart w:id="53" w:name="_Toc18054"/>
       <w:r>
         <w:rPr>
           <w:rFonts w:ascii="黑体" w:hAnsi="黑体" w:eastAsia="黑体" w:cs="黑体"/>
         </w:rPr>
         <w:t>10.2 自动化测试入口</w:t>
       </w:r>
-      <w:bookmarkEnd w:id="54"/>
+      <w:bookmarkEnd w:id="53"/>
     </w:p>
     <w:p>
       <w:pPr>
@@ -23935,14 +23958,14 @@
       <w:pPr>
         <w:pStyle w:val="4"/>
       </w:pPr>
-      <w:bookmarkStart w:id="55" w:name="_Toc28193"/>
+      <w:bookmarkStart w:id="54" w:name="_Toc10720"/>
       <w:r>
         <w:rPr>
           <w:rFonts w:ascii="黑体" w:hAnsi="黑体" w:eastAsia="黑体" w:cs="黑体"/>
         </w:rPr>
         <w:t>10.3 重点测试矩阵</w:t>
       </w:r>
-      <w:bookmarkEnd w:id="55"/>
+      <w:bookmarkEnd w:id="54"/>
     </w:p>
     <w:tbl>
       <w:tblPr>
@@ -24521,14 +24544,14 @@
       <w:pPr>
         <w:pStyle w:val="4"/>
       </w:pPr>
-      <w:bookmarkStart w:id="56" w:name="_Toc21165"/>
+      <w:bookmarkStart w:id="55" w:name="_Toc27492"/>
       <w:r>
         <w:rPr>
           <w:rFonts w:ascii="黑体" w:hAnsi="黑体" w:eastAsia="黑体" w:cs="黑体"/>
         </w:rPr>
         <w:t>10.4 实机分级放行</w:t>
       </w:r>
-      <w:bookmarkEnd w:id="56"/>
+      <w:bookmarkEnd w:id="55"/>
     </w:p>
     <w:tbl>
       <w:tblPr>
@@ -25200,27 +25223,27 @@
       <w:pPr>
         <w:pStyle w:val="3"/>
       </w:pPr>
-      <w:bookmarkStart w:id="57" w:name="_Toc7982"/>
+      <w:bookmarkStart w:id="56" w:name="_Toc1293"/>
       <w:r>
         <w:rPr>
           <w:rFonts w:ascii="黑体" w:hAnsi="黑体" w:eastAsia="黑体" w:cs="黑体"/>
         </w:rPr>
         <w:t>11  烧写、启动与恢复</w:t>
       </w:r>
-      <w:bookmarkEnd w:id="57"/>
+      <w:bookmarkEnd w:id="56"/>
     </w:p>
     <w:p>
       <w:pPr>
         <w:pStyle w:val="4"/>
       </w:pPr>
-      <w:bookmarkStart w:id="58" w:name="_Toc30705"/>
+      <w:bookmarkStart w:id="57" w:name="_Toc31393"/>
       <w:r>
         <w:rPr>
           <w:rFonts w:ascii="黑体" w:hAnsi="黑体" w:eastAsia="黑体" w:cs="黑体"/>
         </w:rPr>
         <w:t>11.1 SWD 主通道</w:t>
       </w:r>
-      <w:bookmarkEnd w:id="58"/>
+      <w:bookmarkEnd w:id="57"/>
     </w:p>
     <w:p>
       <w:r>
@@ -25286,14 +25309,14 @@
       <w:pPr>
         <w:pStyle w:val="4"/>
       </w:pPr>
-      <w:bookmarkStart w:id="59" w:name="_Toc27847"/>
+      <w:bookmarkStart w:id="58" w:name="_Toc31400"/>
       <w:r>
         <w:rPr>
           <w:rFonts w:ascii="黑体" w:hAnsi="黑体" w:eastAsia="黑体" w:cs="黑体"/>
         </w:rPr>
         <w:t>11.2 ISP 恢复通道</w:t>
       </w:r>
-      <w:bookmarkEnd w:id="59"/>
+      <w:bookmarkEnd w:id="58"/>
     </w:p>
     <w:p>
       <w:r>
@@ -25311,14 +25334,14 @@
       <w:pPr>
         <w:pStyle w:val="4"/>
       </w:pPr>
-      <w:bookmarkStart w:id="60" w:name="_Toc8983"/>
+      <w:bookmarkStart w:id="59" w:name="_Toc7933"/>
       <w:r>
         <w:rPr>
           <w:rFonts w:ascii="黑体" w:hAnsi="黑体" w:eastAsia="黑体" w:cs="黑体"/>
         </w:rPr>
         <w:t>11.3 烧写检查清单</w:t>
       </w:r>
-      <w:bookmarkEnd w:id="60"/>
+      <w:bookmarkEnd w:id="59"/>
     </w:p>
     <w:p>
       <w:pPr>
@@ -25429,14 +25452,14 @@
       <w:pPr>
         <w:pStyle w:val="4"/>
       </w:pPr>
-      <w:bookmarkStart w:id="61" w:name="_Toc19228"/>
+      <w:bookmarkStart w:id="60" w:name="_Toc12465"/>
       <w:r>
         <w:rPr>
           <w:rFonts w:ascii="黑体" w:hAnsi="黑体" w:eastAsia="黑体" w:cs="黑体"/>
         </w:rPr>
         <w:t>11.4 回退策略</w:t>
       </w:r>
-      <w:bookmarkEnd w:id="61"/>
+      <w:bookmarkEnd w:id="60"/>
     </w:p>
     <w:p>
       <w:r>
@@ -25454,27 +25477,27 @@
       <w:pPr>
         <w:pStyle w:val="3"/>
       </w:pPr>
-      <w:bookmarkStart w:id="62" w:name="_Toc5597"/>
+      <w:bookmarkStart w:id="61" w:name="_Toc31665"/>
       <w:r>
         <w:rPr>
           <w:rFonts w:ascii="黑体" w:hAnsi="黑体" w:eastAsia="黑体" w:cs="黑体"/>
         </w:rPr>
         <w:t>12  调试与故障定位</w:t>
       </w:r>
-      <w:bookmarkEnd w:id="62"/>
+      <w:bookmarkEnd w:id="61"/>
     </w:p>
     <w:p>
       <w:pPr>
         <w:pStyle w:val="4"/>
       </w:pPr>
-      <w:bookmarkStart w:id="63" w:name="_Toc16921"/>
+      <w:bookmarkStart w:id="62" w:name="_Toc26058"/>
       <w:r>
         <w:rPr>
           <w:rFonts w:ascii="黑体" w:hAnsi="黑体" w:eastAsia="黑体" w:cs="黑体"/>
         </w:rPr>
         <w:t>12.1 调试方法</w:t>
       </w:r>
-      <w:bookmarkEnd w:id="63"/>
+      <w:bookmarkEnd w:id="62"/>
     </w:p>
     <w:tbl>
       <w:tblPr>
@@ -26130,14 +26153,14 @@
       <w:pPr>
         <w:pStyle w:val="4"/>
       </w:pPr>
-      <w:bookmarkStart w:id="64" w:name="_Toc22811"/>
+      <w:bookmarkStart w:id="63" w:name="_Toc9180"/>
       <w:r>
         <w:rPr>
           <w:rFonts w:ascii="黑体" w:hAnsi="黑体" w:eastAsia="黑体" w:cs="黑体"/>
         </w:rPr>
         <w:t>12.2 日志与记录</w:t>
       </w:r>
-      <w:bookmarkEnd w:id="64"/>
+      <w:bookmarkEnd w:id="63"/>
     </w:p>
     <w:p>
       <w:r>
@@ -26155,14 +26178,14 @@
       <w:pPr>
         <w:pStyle w:val="4"/>
       </w:pPr>
-      <w:bookmarkStart w:id="65" w:name="_Toc15719"/>
+      <w:bookmarkStart w:id="64" w:name="_Toc7040"/>
       <w:r>
         <w:rPr>
           <w:rFonts w:ascii="黑体" w:hAnsi="黑体" w:eastAsia="黑体" w:cs="黑体"/>
         </w:rPr>
         <w:t>12.3 高风险开发陷阱</w:t>
       </w:r>
-      <w:bookmarkEnd w:id="65"/>
+      <w:bookmarkEnd w:id="64"/>
     </w:p>
     <w:tbl>
       <w:tblPr>
@@ -26895,27 +26918,27 @@
       <w:pPr>
         <w:pStyle w:val="3"/>
       </w:pPr>
-      <w:bookmarkStart w:id="66" w:name="_Toc24380"/>
+      <w:bookmarkStart w:id="65" w:name="_Toc27193"/>
       <w:r>
         <w:rPr>
           <w:rFonts w:ascii="黑体" w:hAnsi="黑体" w:eastAsia="黑体" w:cs="黑体"/>
         </w:rPr>
         <w:t>13  发布与维护</w:t>
       </w:r>
-      <w:bookmarkEnd w:id="66"/>
+      <w:bookmarkEnd w:id="65"/>
     </w:p>
     <w:p>
       <w:pPr>
         <w:pStyle w:val="4"/>
       </w:pPr>
-      <w:bookmarkStart w:id="67" w:name="_Toc28039"/>
+      <w:bookmarkStart w:id="66" w:name="_Toc15248"/>
       <w:r>
         <w:rPr>
           <w:rFonts w:ascii="黑体" w:hAnsi="黑体" w:eastAsia="黑体" w:cs="黑体"/>
         </w:rPr>
         <w:t>13.1 发布流程</w:t>
       </w:r>
-      <w:bookmarkEnd w:id="67"/>
+      <w:bookmarkEnd w:id="66"/>
     </w:p>
     <w:p>
       <w:pPr>
@@ -27011,14 +27034,14 @@
       <w:pPr>
         <w:pStyle w:val="4"/>
       </w:pPr>
-      <w:bookmarkStart w:id="68" w:name="_Toc1910"/>
+      <w:bookmarkStart w:id="67" w:name="_Toc13238"/>
       <w:r>
         <w:rPr>
           <w:rFonts w:ascii="黑体" w:hAnsi="黑体" w:eastAsia="黑体" w:cs="黑体"/>
         </w:rPr>
         <w:t>13.2 发布检查表</w:t>
       </w:r>
-      <w:bookmarkEnd w:id="68"/>
+      <w:bookmarkEnd w:id="67"/>
     </w:p>
     <w:p>
       <w:pPr>
@@ -27129,14 +27152,14 @@
       <w:pPr>
         <w:pStyle w:val="4"/>
       </w:pPr>
-      <w:bookmarkStart w:id="69" w:name="_Toc19110"/>
+      <w:bookmarkStart w:id="68" w:name="_Toc22705"/>
       <w:r>
         <w:rPr>
           <w:rFonts w:ascii="黑体" w:hAnsi="黑体" w:eastAsia="黑体" w:cs="黑体"/>
         </w:rPr>
         <w:t>13.3 扩展开发建议</w:t>
       </w:r>
-      <w:bookmarkEnd w:id="69"/>
+      <w:bookmarkEnd w:id="68"/>
     </w:p>
     <w:p>
       <w:r>
@@ -27154,27 +27177,27 @@
       <w:pPr>
         <w:pStyle w:val="3"/>
       </w:pPr>
-      <w:bookmarkStart w:id="70" w:name="_Toc28624"/>
+      <w:bookmarkStart w:id="69" w:name="_Toc2986"/>
       <w:r>
         <w:rPr>
           <w:rFonts w:ascii="黑体" w:hAnsi="黑体" w:eastAsia="黑体" w:cs="黑体"/>
         </w:rPr>
         <w:t>14  附录</w:t>
       </w:r>
-      <w:bookmarkEnd w:id="70"/>
+      <w:bookmarkEnd w:id="69"/>
     </w:p>
     <w:p>
       <w:pPr>
         <w:pStyle w:val="4"/>
       </w:pPr>
-      <w:bookmarkStart w:id="71" w:name="_Toc3860"/>
+      <w:bookmarkStart w:id="70" w:name="_Toc28274"/>
       <w:r>
         <w:rPr>
           <w:rFonts w:ascii="黑体" w:hAnsi="黑体" w:eastAsia="黑体" w:cs="黑体"/>
         </w:rPr>
         <w:t>14.1 常用命令</w:t>
       </w:r>
-      <w:bookmarkEnd w:id="71"/>
+      <w:bookmarkEnd w:id="70"/>
     </w:p>
     <w:p>
       <w:pPr>
@@ -27386,14 +27409,14 @@
       <w:pPr>
         <w:pStyle w:val="4"/>
       </w:pPr>
-      <w:bookmarkStart w:id="72" w:name="_Toc13360"/>
+      <w:bookmarkStart w:id="71" w:name="_Toc28337"/>
       <w:r>
         <w:rPr>
           <w:rFonts w:ascii="黑体" w:hAnsi="黑体" w:eastAsia="黑体" w:cs="黑体"/>
         </w:rPr>
         <w:t>14.2 关键常量</w:t>
       </w:r>
-      <w:bookmarkEnd w:id="72"/>
+      <w:bookmarkEnd w:id="71"/>
     </w:p>
     <w:tbl>
       <w:tblPr>
@@ -28380,14 +28403,14 @@
       <w:pPr>
         <w:pStyle w:val="4"/>
       </w:pPr>
-      <w:bookmarkStart w:id="73" w:name="_Toc28303"/>
+      <w:bookmarkStart w:id="72" w:name="_Toc24865"/>
       <w:r>
         <w:rPr>
           <w:rFonts w:ascii="黑体" w:hAnsi="黑体" w:eastAsia="黑体" w:cs="黑体"/>
         </w:rPr>
         <w:t>14.3 安全停止线</w:t>
       </w:r>
-      <w:bookmarkEnd w:id="73"/>
+      <w:bookmarkEnd w:id="72"/>
     </w:p>
     <w:p>
       <w:pPr>
@@ -28817,7 +28840,7 @@
     <w:lsdException w:uiPriority="99" w:name="footnote text"/>
     <w:lsdException w:uiPriority="99" w:name="annotation text"/>
     <w:lsdException w:qFormat="1" w:uiPriority="99" w:semiHidden="0" w:name="header"/>
-    <w:lsdException w:uiPriority="99" w:semiHidden="0" w:name="footer"/>
+    <w:lsdException w:qFormat="1" w:uiPriority="99" w:semiHidden="0" w:name="footer"/>
     <w:lsdException w:uiPriority="99" w:name="index heading"/>
     <w:lsdException w:qFormat="1" w:uiPriority="35" w:name="caption"/>
     <w:lsdException w:uiPriority="99" w:name="table of figures"/>
@@ -28865,7 +28888,7 @@
     <w:lsdException w:uiPriority="99" w:name="Body Text First Indent"/>
     <w:lsdException w:uiPriority="99" w:name="Body Text First Indent 2"/>
     <w:lsdException w:uiPriority="99" w:name="Note Heading"/>
-    <w:lsdException w:uiPriority="99" w:semiHidden="0" w:name="Body Text 2"/>
+    <w:lsdException w:qFormat="1" w:uiPriority="99" w:semiHidden="0" w:name="Body Text 2"/>
     <w:lsdException w:qFormat="1" w:uiPriority="99" w:semiHidden="0" w:name="Body Text 3"/>
     <w:lsdException w:uiPriority="99" w:name="Body Text Indent 2"/>
     <w:lsdException w:uiPriority="99" w:name="Body Text Indent 3"/>
@@ -29500,6 +29523,7 @@
     <w:basedOn w:val="1"/>
     <w:link w:val="138"/>
     <w:unhideWhenUsed/>
+    <w:qFormat/>
     <w:uiPriority w:val="99"/>
     <w:pPr>
       <w:tabs>
@@ -29580,6 +29604,7 @@
     <w:basedOn w:val="1"/>
     <w:link w:val="147"/>
     <w:unhideWhenUsed/>
+    <w:qFormat/>
     <w:uiPriority w:val="99"/>
     <w:pPr>
       <w:spacing w:after="120" w:line="480" w:lineRule="auto"/>

</xml_diff>